<commit_message>
Update project plan and add architecture diagrams
</commit_message>
<xml_diff>
--- a/doc/2026 AI 大赛项目计划书.docx
+++ b/doc/2026 AI 大赛项目计划书.docx
@@ -394,11 +394,20 @@
     </w:p>
     <w:p>
       <w:r>
-        <w:rPr>
-          <w:i/>
-          <w:iCs/>
-        </w:rPr>
-        <w:t>(请描述当前业务或技术的痛点，以及本项目希望解决的核心问题，建议100–200字。)</w:t>
+        <w:t>城市白领热衷于</w:t>
+      </w:r>
+      <w:proofErr w:type="gramStart"/>
+      <w:r>
+        <w:t>购买绿植装点</w:t>
+      </w:r>
+      <w:proofErr w:type="gramEnd"/>
+      <w:r>
+        <w:t>家居，但植物死亡率高居不下——买回家2天内枯萎、90天内死亡比例超过70%。用户面临的核心困境是：养护知识获取渠道有限，网上搜索的通用指南难以适配自己的种植环境（城市、季节、朝向、暖气等差异），即使向AI提问获得答案，仍因缺乏针对性而无法有效救治。</w:t>
+      </w:r>
+    </w:p>
+    <w:p>
+      <w:r>
+        <w:t>当前市场存在的解决方案均为通用型工具，仅提供植物识别或百科信息，无法回答"你家的植物，在你的环境下，今天应该怎么养"这一核心问题。植物管家旨在通过AI+环境感知技术，为每位用户构建个性化的智能植物养护闭环。</w:t>
       </w:r>
     </w:p>
     <w:p>
@@ -424,22 +433,92 @@
         </w:numPr>
       </w:pPr>
       <w:r>
+        <w:rPr>
+          <w:rFonts w:hint="eastAsia"/>
+        </w:rPr>
+        <w:t>目标 1：6个月内完成MVP纯软件（</w:t>
+      </w:r>
+      <w:proofErr w:type="gramStart"/>
+      <w:r>
+        <w:rPr>
+          <w:rFonts w:hint="eastAsia"/>
+        </w:rPr>
+        <w:t>微信小</w:t>
+      </w:r>
+      <w:proofErr w:type="gramEnd"/>
+      <w:r>
+        <w:rPr>
+          <w:rFonts w:hint="eastAsia"/>
+        </w:rPr>
+        <w:t>程序）核心功能上线，实现植物识别、个性化养护计划生成、动态提醒及病害诊断四大功能，解决用户植物养护难题。</w:t>
+      </w:r>
+    </w:p>
+    <w:p>
+      <w:pPr>
+        <w:numPr>
+          <w:ilvl w:val="0"/>
+          <w:numId w:val="4"/>
+        </w:numPr>
+      </w:pPr>
+      <w:r>
+        <w:rPr>
+          <w:rFonts w:hint="eastAsia"/>
+        </w:rPr>
+        <w:t>目标 2：项目上线6个月内，通过自然增长与社交裂变获取1万名种子用户，完成初期产品验证。</w:t>
+      </w:r>
+    </w:p>
+    <w:p>
+      <w:pPr>
+        <w:numPr>
+          <w:ilvl w:val="0"/>
+          <w:numId w:val="4"/>
+        </w:numPr>
+      </w:pPr>
+      <w:r>
+        <w:rPr>
+          <w:rFonts w:hint="eastAsia"/>
+        </w:rPr>
+        <w:t>目标 3：项目运营第一年达成注册用户50万+，</w:t>
+      </w:r>
+      <w:proofErr w:type="gramStart"/>
+      <w:r>
+        <w:rPr>
+          <w:rFonts w:hint="eastAsia"/>
+        </w:rPr>
+        <w:t>月活跃</w:t>
+      </w:r>
+      <w:proofErr w:type="gramEnd"/>
+      <w:r>
+        <w:rPr>
+          <w:rFonts w:hint="eastAsia"/>
+        </w:rPr>
+        <w:t>用户率（MAU）达到40%以上。</w:t>
+      </w:r>
+    </w:p>
+    <w:p>
+      <w:pPr>
+        <w:numPr>
+          <w:ilvl w:val="0"/>
+          <w:numId w:val="4"/>
+        </w:numPr>
+      </w:pPr>
+      <w:r>
+        <w:rPr>
+          <w:rFonts w:hint="eastAsia"/>
+        </w:rPr>
+        <w:t>目标 4：项目运营第一年实现付费转化率3%+，获取付费用户1.5万+，完成商业化闭环验证。</w:t>
+      </w:r>
+      <w:r>
         <w:t>目标 1：[例如：实现3分钟内自动生成高质量短视频]</w:t>
       </w:r>
     </w:p>
     <w:p>
       <w:pPr>
+        <w:pStyle w:val="ListParagraph"/>
         <w:numPr>
-          <w:ilvl w:val="0"/>
-          <w:numId w:val="4"/>
+          <w:ilvl w:val="1"/>
+          <w:numId w:val="7"/>
         </w:numPr>
-      </w:pPr>
-      <w:r>
-        <w:t>目标 2：[例如：本地模型库推理速度提升30%]</w:t>
-      </w:r>
-    </w:p>
-    <w:p>
-      <w:pPr>
         <w:rPr>
           <w:b/>
           <w:bCs/>
@@ -450,18 +529,168 @@
           <w:b/>
           <w:bCs/>
         </w:rPr>
-        <w:t>2.3 核心功能与亮点</w:t>
+        <w:t>核心功能与亮点</w:t>
       </w:r>
     </w:p>
     <w:p>
       <w:pPr>
+        <w:pStyle w:val="ListParagraph"/>
         <w:numPr>
           <w:ilvl w:val="0"/>
           <w:numId w:val="5"/>
         </w:numPr>
+        <w:rPr>
+          <w:b/>
+          <w:bCs/>
+        </w:rPr>
       </w:pPr>
       <w:r>
-        <w:t>[核心功能描述]</w:t>
+        <w:rPr>
+          <w:rFonts w:hint="eastAsia"/>
+        </w:rPr>
+        <w:t>核心功能描述</w:t>
+      </w:r>
+    </w:p>
+    <w:p>
+      <w:pPr>
+        <w:pStyle w:val="ListParagraph"/>
+        <w:numPr>
+          <w:ilvl w:val="0"/>
+          <w:numId w:val="8"/>
+        </w:numPr>
+      </w:pPr>
+      <w:r>
+        <w:t>植物识别</w:t>
+      </w:r>
+    </w:p>
+    <w:p>
+      <w:pPr>
+        <w:ind w:left="720"/>
+      </w:pPr>
+      <w:r>
+        <w:rPr>
+          <w:rFonts w:hint="eastAsia"/>
+        </w:rPr>
+        <w:t>用户拍照上传，即可识别植物品种、科属、养护难度，并自动关联养护知识库。调用百度</w:t>
+      </w:r>
+      <w:r>
+        <w:t>AI植物识别API，支持2万+品种，准确率超95%。</w:t>
+      </w:r>
+    </w:p>
+    <w:p>
+      <w:pPr>
+        <w:pStyle w:val="ListParagraph"/>
+        <w:numPr>
+          <w:ilvl w:val="0"/>
+          <w:numId w:val="8"/>
+        </w:numPr>
+      </w:pPr>
+      <w:r>
+        <w:t>个性化养护计划</w:t>
+      </w:r>
+    </w:p>
+    <w:p>
+      <w:pPr>
+        <w:ind w:left="720"/>
+      </w:pPr>
+      <w:r>
+        <w:rPr>
+          <w:rFonts w:hint="eastAsia"/>
+        </w:rPr>
+        <w:t>根据用户植物品种、所处城市、实时天气、室内环境（暖气</w:t>
+      </w:r>
+      <w:r>
+        <w:t>/空调/朝向）等多维度因素，生成"你家的植物在你的环境下应该怎么养"的个性化养护方案，包含浇水频率、浇水量、施肥时机、换</w:t>
+      </w:r>
+      <w:proofErr w:type="gramStart"/>
+      <w:r>
+        <w:t>盆建议</w:t>
+      </w:r>
+      <w:proofErr w:type="gramEnd"/>
+      <w:r>
+        <w:t>等。</w:t>
+      </w:r>
+    </w:p>
+    <w:p>
+      <w:pPr>
+        <w:pStyle w:val="ListParagraph"/>
+        <w:numPr>
+          <w:ilvl w:val="0"/>
+          <w:numId w:val="8"/>
+        </w:numPr>
+      </w:pPr>
+      <w:r>
+        <w:t>环境感知智能提醒</w:t>
+      </w:r>
+    </w:p>
+    <w:p>
+      <w:pPr>
+        <w:ind w:left="720"/>
+      </w:pPr>
+      <w:r>
+        <w:rPr>
+          <w:rFonts w:hint="eastAsia"/>
+        </w:rPr>
+        <w:t>结合天气</w:t>
+      </w:r>
+      <w:r>
+        <w:t>API动态调整提醒时机：高温天提前、雨天延迟、暖气季增加频次。用户</w:t>
+      </w:r>
+      <w:r>
+        <w:lastRenderedPageBreak/>
+        <w:t>拍照土壤后可根据实际干湿状态跳过或提前提醒，用户跳过行为自动学习优化下次提醒。</w:t>
+      </w:r>
+    </w:p>
+    <w:p>
+      <w:pPr>
+        <w:pStyle w:val="ListParagraph"/>
+        <w:numPr>
+          <w:ilvl w:val="0"/>
+          <w:numId w:val="8"/>
+        </w:numPr>
+      </w:pPr>
+      <w:r>
+        <w:t>土壤识别</w:t>
+      </w:r>
+    </w:p>
+    <w:p>
+      <w:pPr>
+        <w:ind w:left="720"/>
+      </w:pPr>
+      <w:r>
+        <w:rPr>
+          <w:rFonts w:hint="eastAsia"/>
+        </w:rPr>
+        <w:t>用户拍照土壤，</w:t>
+      </w:r>
+      <w:r>
+        <w:t>AI图像分析颜色和纹理特征，判断湿度等级（非常湿/偏湿/适中/偏干/非常干），辅助判断是否应该浇水——无需硬件传感器，纯软件低成本实现。</w:t>
+      </w:r>
+    </w:p>
+    <w:p>
+      <w:pPr>
+        <w:pStyle w:val="ListParagraph"/>
+        <w:numPr>
+          <w:ilvl w:val="0"/>
+          <w:numId w:val="8"/>
+        </w:numPr>
+      </w:pPr>
+      <w:r>
+        <w:t>在线病害诊断</w:t>
+      </w:r>
+    </w:p>
+    <w:p>
+      <w:pPr>
+        <w:ind w:left="720"/>
+      </w:pPr>
+      <w:r>
+        <w:rPr>
+          <w:rFonts w:hint="eastAsia"/>
+        </w:rPr>
+        <w:t>用户拍照叶片并描述症状，</w:t>
+      </w:r>
+      <w:r>
+        <w:t>AI图像分析+大模型理解，结合知识库给出诊断结果和救治方案，支持常见病害（叶斑病、根腐病、蚜虫、红蜘蛛等）识别及营养缺乏判断。</w:t>
       </w:r>
     </w:p>
     <w:p>
@@ -472,8 +701,904 @@
         </w:numPr>
       </w:pPr>
       <w:r>
-        <w:t>[差异化竞争优势]</w:t>
+        <w:t>差异化竞争优势</w:t>
       </w:r>
+    </w:p>
+    <w:tbl>
+      <w:tblPr>
+        <w:tblW w:w="8781" w:type="dxa"/>
+        <w:tblInd w:w="420" w:type="dxa"/>
+        <w:shd w:val="clear" w:color="auto" w:fill="FFFFFF"/>
+        <w:tblCellMar>
+          <w:top w:w="15" w:type="dxa"/>
+          <w:left w:w="15" w:type="dxa"/>
+          <w:bottom w:w="15" w:type="dxa"/>
+          <w:right w:w="15" w:type="dxa"/>
+        </w:tblCellMar>
+        <w:tblLook w:val="04A0" w:firstRow="1" w:lastRow="0" w:firstColumn="1" w:lastColumn="0" w:noHBand="0" w:noVBand="1"/>
+      </w:tblPr>
+      <w:tblGrid>
+        <w:gridCol w:w="1410"/>
+        <w:gridCol w:w="3691"/>
+        <w:gridCol w:w="3680"/>
+      </w:tblGrid>
+      <w:tr>
+        <w:trPr>
+          <w:tblHeader/>
+        </w:trPr>
+        <w:tc>
+          <w:tcPr>
+            <w:tcW w:w="1410" w:type="dxa"/>
+            <w:tcBorders>
+              <w:top w:val="single" w:sz="6" w:space="0" w:color="auto"/>
+              <w:left w:val="single" w:sz="6" w:space="0" w:color="auto"/>
+              <w:bottom w:val="single" w:sz="6" w:space="0" w:color="auto"/>
+              <w:right w:val="single" w:sz="6" w:space="0" w:color="auto"/>
+            </w:tcBorders>
+            <w:shd w:val="clear" w:color="auto" w:fill="FFFFFF"/>
+            <w:noWrap/>
+            <w:tcMar>
+              <w:top w:w="150" w:type="dxa"/>
+              <w:left w:w="210" w:type="dxa"/>
+              <w:bottom w:w="150" w:type="dxa"/>
+              <w:right w:w="210" w:type="dxa"/>
+            </w:tcMar>
+            <w:vAlign w:val="center"/>
+            <w:hideMark/>
+          </w:tcPr>
+          <w:p>
+            <w:pPr>
+              <w:rPr>
+                <w:sz w:val="18"/>
+                <w:szCs w:val="18"/>
+              </w:rPr>
+            </w:pPr>
+            <w:r>
+              <w:rPr>
+                <w:rFonts w:hint="eastAsia"/>
+                <w:sz w:val="18"/>
+                <w:szCs w:val="18"/>
+              </w:rPr>
+              <w:t>竞争维度</w:t>
+            </w:r>
+          </w:p>
+        </w:tc>
+        <w:tc>
+          <w:tcPr>
+            <w:tcW w:w="3691" w:type="dxa"/>
+            <w:tcBorders>
+              <w:top w:val="single" w:sz="6" w:space="0" w:color="auto"/>
+              <w:left w:val="single" w:sz="6" w:space="0" w:color="auto"/>
+              <w:bottom w:val="single" w:sz="6" w:space="0" w:color="auto"/>
+              <w:right w:val="single" w:sz="6" w:space="0" w:color="auto"/>
+            </w:tcBorders>
+            <w:shd w:val="clear" w:color="auto" w:fill="FFFFFF"/>
+            <w:noWrap/>
+            <w:tcMar>
+              <w:top w:w="150" w:type="dxa"/>
+              <w:left w:w="210" w:type="dxa"/>
+              <w:bottom w:w="150" w:type="dxa"/>
+              <w:right w:w="210" w:type="dxa"/>
+            </w:tcMar>
+            <w:vAlign w:val="center"/>
+            <w:hideMark/>
+          </w:tcPr>
+          <w:p>
+            <w:pPr>
+              <w:rPr>
+                <w:sz w:val="18"/>
+                <w:szCs w:val="18"/>
+              </w:rPr>
+            </w:pPr>
+            <w:r>
+              <w:rPr>
+                <w:rFonts w:hint="eastAsia"/>
+                <w:sz w:val="18"/>
+                <w:szCs w:val="18"/>
+              </w:rPr>
+              <w:t>植物管家</w:t>
+            </w:r>
+          </w:p>
+        </w:tc>
+        <w:tc>
+          <w:tcPr>
+            <w:tcW w:w="3680" w:type="dxa"/>
+            <w:tcBorders>
+              <w:top w:val="single" w:sz="6" w:space="0" w:color="auto"/>
+              <w:left w:val="single" w:sz="6" w:space="0" w:color="auto"/>
+              <w:bottom w:val="single" w:sz="6" w:space="0" w:color="auto"/>
+              <w:right w:val="single" w:sz="6" w:space="0" w:color="auto"/>
+            </w:tcBorders>
+            <w:shd w:val="clear" w:color="auto" w:fill="FFFFFF"/>
+            <w:noWrap/>
+            <w:tcMar>
+              <w:top w:w="150" w:type="dxa"/>
+              <w:left w:w="210" w:type="dxa"/>
+              <w:bottom w:w="150" w:type="dxa"/>
+              <w:right w:w="210" w:type="dxa"/>
+            </w:tcMar>
+            <w:vAlign w:val="center"/>
+            <w:hideMark/>
+          </w:tcPr>
+          <w:p>
+            <w:pPr>
+              <w:rPr>
+                <w:sz w:val="18"/>
+                <w:szCs w:val="18"/>
+              </w:rPr>
+            </w:pPr>
+            <w:r>
+              <w:rPr>
+                <w:rFonts w:hint="eastAsia"/>
+                <w:sz w:val="18"/>
+                <w:szCs w:val="18"/>
+              </w:rPr>
+              <w:t>现有竞品（形色/识花/养花大全/小米花盆）</w:t>
+            </w:r>
+          </w:p>
+        </w:tc>
+      </w:tr>
+      <w:tr>
+        <w:tc>
+          <w:tcPr>
+            <w:tcW w:w="1410" w:type="dxa"/>
+            <w:tcBorders>
+              <w:top w:val="single" w:sz="6" w:space="0" w:color="auto"/>
+              <w:left w:val="single" w:sz="6" w:space="0" w:color="auto"/>
+              <w:bottom w:val="single" w:sz="6" w:space="0" w:color="auto"/>
+              <w:right w:val="single" w:sz="6" w:space="0" w:color="auto"/>
+            </w:tcBorders>
+            <w:shd w:val="clear" w:color="auto" w:fill="FFFFFF"/>
+            <w:tcMar>
+              <w:top w:w="150" w:type="dxa"/>
+              <w:left w:w="210" w:type="dxa"/>
+              <w:bottom w:w="150" w:type="dxa"/>
+              <w:right w:w="210" w:type="dxa"/>
+            </w:tcMar>
+            <w:vAlign w:val="center"/>
+            <w:hideMark/>
+          </w:tcPr>
+          <w:p>
+            <w:pPr>
+              <w:rPr>
+                <w:sz w:val="18"/>
+                <w:szCs w:val="18"/>
+              </w:rPr>
+            </w:pPr>
+            <w:r>
+              <w:rPr>
+                <w:rFonts w:hint="eastAsia"/>
+                <w:sz w:val="18"/>
+                <w:szCs w:val="18"/>
+              </w:rPr>
+              <w:t>个性化深度</w:t>
+            </w:r>
+          </w:p>
+        </w:tc>
+        <w:tc>
+          <w:tcPr>
+            <w:tcW w:w="3691" w:type="dxa"/>
+            <w:tcBorders>
+              <w:top w:val="single" w:sz="6" w:space="0" w:color="auto"/>
+              <w:left w:val="single" w:sz="6" w:space="0" w:color="auto"/>
+              <w:bottom w:val="single" w:sz="6" w:space="0" w:color="auto"/>
+              <w:right w:val="single" w:sz="6" w:space="0" w:color="auto"/>
+            </w:tcBorders>
+            <w:shd w:val="clear" w:color="auto" w:fill="FFFFFF"/>
+            <w:tcMar>
+              <w:top w:w="150" w:type="dxa"/>
+              <w:left w:w="210" w:type="dxa"/>
+              <w:bottom w:w="150" w:type="dxa"/>
+              <w:right w:w="210" w:type="dxa"/>
+            </w:tcMar>
+            <w:vAlign w:val="center"/>
+            <w:hideMark/>
+          </w:tcPr>
+          <w:p>
+            <w:pPr>
+              <w:rPr>
+                <w:sz w:val="18"/>
+                <w:szCs w:val="18"/>
+              </w:rPr>
+            </w:pPr>
+            <w:r>
+              <w:rPr>
+                <w:rFonts w:ascii="Segoe UI Emoji" w:hAnsi="Segoe UI Emoji" w:cs="Segoe UI Emoji"/>
+                <w:sz w:val="18"/>
+                <w:szCs w:val="18"/>
+              </w:rPr>
+              <w:t>✅</w:t>
+            </w:r>
+            <w:r>
+              <w:rPr>
+                <w:rFonts w:hint="eastAsia"/>
+                <w:sz w:val="18"/>
+                <w:szCs w:val="18"/>
+              </w:rPr>
+              <w:t> 深度本地化：结合品种×城市×天气×室内环境×土壤，生成专属养护方案</w:t>
+            </w:r>
+          </w:p>
+        </w:tc>
+        <w:tc>
+          <w:tcPr>
+            <w:tcW w:w="3680" w:type="dxa"/>
+            <w:tcBorders>
+              <w:top w:val="single" w:sz="6" w:space="0" w:color="auto"/>
+              <w:left w:val="single" w:sz="6" w:space="0" w:color="auto"/>
+              <w:bottom w:val="single" w:sz="6" w:space="0" w:color="auto"/>
+              <w:right w:val="single" w:sz="6" w:space="0" w:color="auto"/>
+            </w:tcBorders>
+            <w:shd w:val="clear" w:color="auto" w:fill="FFFFFF"/>
+            <w:tcMar>
+              <w:top w:w="150" w:type="dxa"/>
+              <w:left w:w="210" w:type="dxa"/>
+              <w:bottom w:w="150" w:type="dxa"/>
+              <w:right w:w="210" w:type="dxa"/>
+            </w:tcMar>
+            <w:vAlign w:val="center"/>
+            <w:hideMark/>
+          </w:tcPr>
+          <w:p>
+            <w:pPr>
+              <w:rPr>
+                <w:sz w:val="18"/>
+                <w:szCs w:val="18"/>
+              </w:rPr>
+            </w:pPr>
+            <w:r>
+              <w:rPr>
+                <w:rFonts w:ascii="Segoe UI Emoji" w:hAnsi="Segoe UI Emoji" w:cs="Segoe UI Emoji"/>
+                <w:sz w:val="18"/>
+                <w:szCs w:val="18"/>
+              </w:rPr>
+              <w:t>❌</w:t>
+            </w:r>
+            <w:r>
+              <w:rPr>
+                <w:rFonts w:hint="eastAsia"/>
+                <w:sz w:val="18"/>
+                <w:szCs w:val="18"/>
+              </w:rPr>
+              <w:t xml:space="preserve"> 仅返回通用百科或固定指南</w:t>
+            </w:r>
+          </w:p>
+        </w:tc>
+      </w:tr>
+      <w:tr>
+        <w:tc>
+          <w:tcPr>
+            <w:tcW w:w="1410" w:type="dxa"/>
+            <w:tcBorders>
+              <w:top w:val="single" w:sz="6" w:space="0" w:color="auto"/>
+              <w:left w:val="single" w:sz="6" w:space="0" w:color="auto"/>
+              <w:bottom w:val="single" w:sz="6" w:space="0" w:color="auto"/>
+              <w:right w:val="single" w:sz="6" w:space="0" w:color="auto"/>
+            </w:tcBorders>
+            <w:shd w:val="clear" w:color="auto" w:fill="FFFFFF"/>
+            <w:tcMar>
+              <w:top w:w="150" w:type="dxa"/>
+              <w:left w:w="210" w:type="dxa"/>
+              <w:bottom w:w="150" w:type="dxa"/>
+              <w:right w:w="210" w:type="dxa"/>
+            </w:tcMar>
+            <w:vAlign w:val="center"/>
+            <w:hideMark/>
+          </w:tcPr>
+          <w:p>
+            <w:pPr>
+              <w:rPr>
+                <w:sz w:val="18"/>
+                <w:szCs w:val="18"/>
+              </w:rPr>
+            </w:pPr>
+            <w:r>
+              <w:rPr>
+                <w:rFonts w:hint="eastAsia"/>
+                <w:sz w:val="18"/>
+                <w:szCs w:val="18"/>
+              </w:rPr>
+              <w:t>动态感知</w:t>
+            </w:r>
+          </w:p>
+        </w:tc>
+        <w:tc>
+          <w:tcPr>
+            <w:tcW w:w="3691" w:type="dxa"/>
+            <w:tcBorders>
+              <w:top w:val="single" w:sz="6" w:space="0" w:color="auto"/>
+              <w:left w:val="single" w:sz="6" w:space="0" w:color="auto"/>
+              <w:bottom w:val="single" w:sz="6" w:space="0" w:color="auto"/>
+              <w:right w:val="single" w:sz="6" w:space="0" w:color="auto"/>
+            </w:tcBorders>
+            <w:shd w:val="clear" w:color="auto" w:fill="FFFFFF"/>
+            <w:tcMar>
+              <w:top w:w="150" w:type="dxa"/>
+              <w:left w:w="210" w:type="dxa"/>
+              <w:bottom w:w="150" w:type="dxa"/>
+              <w:right w:w="210" w:type="dxa"/>
+            </w:tcMar>
+            <w:vAlign w:val="center"/>
+            <w:hideMark/>
+          </w:tcPr>
+          <w:p>
+            <w:pPr>
+              <w:rPr>
+                <w:sz w:val="18"/>
+                <w:szCs w:val="18"/>
+              </w:rPr>
+            </w:pPr>
+            <w:r>
+              <w:rPr>
+                <w:rFonts w:ascii="Segoe UI Emoji" w:hAnsi="Segoe UI Emoji" w:cs="Segoe UI Emoji"/>
+                <w:sz w:val="18"/>
+                <w:szCs w:val="18"/>
+              </w:rPr>
+              <w:t>✅</w:t>
+            </w:r>
+            <w:r>
+              <w:rPr>
+                <w:rFonts w:hint="eastAsia"/>
+                <w:sz w:val="18"/>
+                <w:szCs w:val="18"/>
+              </w:rPr>
+              <w:t> 实时调整：接入天气API实时调整提醒时机，动态感知环境变化</w:t>
+            </w:r>
+          </w:p>
+        </w:tc>
+        <w:tc>
+          <w:tcPr>
+            <w:tcW w:w="3680" w:type="dxa"/>
+            <w:tcBorders>
+              <w:top w:val="single" w:sz="6" w:space="0" w:color="auto"/>
+              <w:left w:val="single" w:sz="6" w:space="0" w:color="auto"/>
+              <w:bottom w:val="single" w:sz="6" w:space="0" w:color="auto"/>
+              <w:right w:val="single" w:sz="6" w:space="0" w:color="auto"/>
+            </w:tcBorders>
+            <w:shd w:val="clear" w:color="auto" w:fill="FFFFFF"/>
+            <w:tcMar>
+              <w:top w:w="150" w:type="dxa"/>
+              <w:left w:w="210" w:type="dxa"/>
+              <w:bottom w:w="150" w:type="dxa"/>
+              <w:right w:w="210" w:type="dxa"/>
+            </w:tcMar>
+            <w:vAlign w:val="center"/>
+            <w:hideMark/>
+          </w:tcPr>
+          <w:p>
+            <w:pPr>
+              <w:rPr>
+                <w:sz w:val="18"/>
+                <w:szCs w:val="18"/>
+              </w:rPr>
+            </w:pPr>
+            <w:r>
+              <w:rPr>
+                <w:rFonts w:ascii="Segoe UI Emoji" w:hAnsi="Segoe UI Emoji" w:cs="Segoe UI Emoji"/>
+                <w:sz w:val="18"/>
+                <w:szCs w:val="18"/>
+              </w:rPr>
+              <w:t>❌</w:t>
+            </w:r>
+            <w:r>
+              <w:rPr>
+                <w:rFonts w:hint="eastAsia"/>
+                <w:sz w:val="18"/>
+                <w:szCs w:val="18"/>
+              </w:rPr>
+              <w:t xml:space="preserve"> 固定Schedule，无环境感知</w:t>
+            </w:r>
+          </w:p>
+        </w:tc>
+      </w:tr>
+      <w:tr>
+        <w:tc>
+          <w:tcPr>
+            <w:tcW w:w="1410" w:type="dxa"/>
+            <w:tcBorders>
+              <w:top w:val="single" w:sz="6" w:space="0" w:color="auto"/>
+              <w:left w:val="single" w:sz="6" w:space="0" w:color="auto"/>
+              <w:bottom w:val="single" w:sz="6" w:space="0" w:color="auto"/>
+              <w:right w:val="single" w:sz="6" w:space="0" w:color="auto"/>
+            </w:tcBorders>
+            <w:shd w:val="clear" w:color="auto" w:fill="FFFFFF"/>
+            <w:tcMar>
+              <w:top w:w="150" w:type="dxa"/>
+              <w:left w:w="210" w:type="dxa"/>
+              <w:bottom w:w="150" w:type="dxa"/>
+              <w:right w:w="210" w:type="dxa"/>
+            </w:tcMar>
+            <w:vAlign w:val="center"/>
+            <w:hideMark/>
+          </w:tcPr>
+          <w:p>
+            <w:pPr>
+              <w:rPr>
+                <w:sz w:val="18"/>
+                <w:szCs w:val="18"/>
+              </w:rPr>
+            </w:pPr>
+            <w:r>
+              <w:rPr>
+                <w:rFonts w:hint="eastAsia"/>
+                <w:sz w:val="18"/>
+                <w:szCs w:val="18"/>
+              </w:rPr>
+              <w:t>软硬结合</w:t>
+            </w:r>
+          </w:p>
+        </w:tc>
+        <w:tc>
+          <w:tcPr>
+            <w:tcW w:w="3691" w:type="dxa"/>
+            <w:tcBorders>
+              <w:top w:val="single" w:sz="6" w:space="0" w:color="auto"/>
+              <w:left w:val="single" w:sz="6" w:space="0" w:color="auto"/>
+              <w:bottom w:val="single" w:sz="6" w:space="0" w:color="auto"/>
+              <w:right w:val="single" w:sz="6" w:space="0" w:color="auto"/>
+            </w:tcBorders>
+            <w:shd w:val="clear" w:color="auto" w:fill="FFFFFF"/>
+            <w:tcMar>
+              <w:top w:w="150" w:type="dxa"/>
+              <w:left w:w="210" w:type="dxa"/>
+              <w:bottom w:w="150" w:type="dxa"/>
+              <w:right w:w="210" w:type="dxa"/>
+            </w:tcMar>
+            <w:vAlign w:val="center"/>
+            <w:hideMark/>
+          </w:tcPr>
+          <w:p>
+            <w:pPr>
+              <w:rPr>
+                <w:sz w:val="18"/>
+                <w:szCs w:val="18"/>
+              </w:rPr>
+            </w:pPr>
+            <w:r>
+              <w:rPr>
+                <w:rFonts w:ascii="Segoe UI Emoji" w:hAnsi="Segoe UI Emoji" w:cs="Segoe UI Emoji"/>
+                <w:sz w:val="18"/>
+                <w:szCs w:val="18"/>
+              </w:rPr>
+              <w:t>✅</w:t>
+            </w:r>
+            <w:r>
+              <w:rPr>
+                <w:rFonts w:hint="eastAsia"/>
+                <w:sz w:val="18"/>
+                <w:szCs w:val="18"/>
+              </w:rPr>
+              <w:t> 深度联动：软件先行，v2阶段实现硬件数据闭环，软件+硬件深度联动</w:t>
+            </w:r>
+          </w:p>
+        </w:tc>
+        <w:tc>
+          <w:tcPr>
+            <w:tcW w:w="3680" w:type="dxa"/>
+            <w:tcBorders>
+              <w:top w:val="single" w:sz="6" w:space="0" w:color="auto"/>
+              <w:left w:val="single" w:sz="6" w:space="0" w:color="auto"/>
+              <w:bottom w:val="single" w:sz="6" w:space="0" w:color="auto"/>
+              <w:right w:val="single" w:sz="6" w:space="0" w:color="auto"/>
+            </w:tcBorders>
+            <w:shd w:val="clear" w:color="auto" w:fill="FFFFFF"/>
+            <w:tcMar>
+              <w:top w:w="150" w:type="dxa"/>
+              <w:left w:w="210" w:type="dxa"/>
+              <w:bottom w:w="150" w:type="dxa"/>
+              <w:right w:w="210" w:type="dxa"/>
+            </w:tcMar>
+            <w:vAlign w:val="center"/>
+            <w:hideMark/>
+          </w:tcPr>
+          <w:p>
+            <w:pPr>
+              <w:rPr>
+                <w:sz w:val="18"/>
+                <w:szCs w:val="18"/>
+              </w:rPr>
+            </w:pPr>
+            <w:r>
+              <w:rPr>
+                <w:rFonts w:ascii="Segoe UI Emoji" w:hAnsi="Segoe UI Emoji" w:cs="Segoe UI Emoji"/>
+                <w:sz w:val="18"/>
+                <w:szCs w:val="18"/>
+              </w:rPr>
+              <w:t>⚠️</w:t>
+            </w:r>
+            <w:r>
+              <w:rPr>
+                <w:rFonts w:hint="eastAsia"/>
+                <w:sz w:val="18"/>
+                <w:szCs w:val="18"/>
+              </w:rPr>
+              <w:t xml:space="preserve"> 小米仅硬件强、软件弱；其他仅有软件</w:t>
+            </w:r>
+          </w:p>
+        </w:tc>
+      </w:tr>
+      <w:tr>
+        <w:tc>
+          <w:tcPr>
+            <w:tcW w:w="1410" w:type="dxa"/>
+            <w:tcBorders>
+              <w:top w:val="single" w:sz="6" w:space="0" w:color="auto"/>
+              <w:left w:val="single" w:sz="6" w:space="0" w:color="auto"/>
+              <w:bottom w:val="single" w:sz="6" w:space="0" w:color="auto"/>
+              <w:right w:val="single" w:sz="6" w:space="0" w:color="auto"/>
+            </w:tcBorders>
+            <w:shd w:val="clear" w:color="auto" w:fill="FFFFFF"/>
+            <w:tcMar>
+              <w:top w:w="150" w:type="dxa"/>
+              <w:left w:w="210" w:type="dxa"/>
+              <w:bottom w:w="150" w:type="dxa"/>
+              <w:right w:w="210" w:type="dxa"/>
+            </w:tcMar>
+            <w:vAlign w:val="center"/>
+            <w:hideMark/>
+          </w:tcPr>
+          <w:p>
+            <w:pPr>
+              <w:rPr>
+                <w:sz w:val="18"/>
+                <w:szCs w:val="18"/>
+              </w:rPr>
+            </w:pPr>
+            <w:r>
+              <w:rPr>
+                <w:rFonts w:hint="eastAsia"/>
+                <w:sz w:val="18"/>
+                <w:szCs w:val="18"/>
+              </w:rPr>
+              <w:t>土壤识别</w:t>
+            </w:r>
+          </w:p>
+        </w:tc>
+        <w:tc>
+          <w:tcPr>
+            <w:tcW w:w="3691" w:type="dxa"/>
+            <w:tcBorders>
+              <w:top w:val="single" w:sz="6" w:space="0" w:color="auto"/>
+              <w:left w:val="single" w:sz="6" w:space="0" w:color="auto"/>
+              <w:bottom w:val="single" w:sz="6" w:space="0" w:color="auto"/>
+              <w:right w:val="single" w:sz="6" w:space="0" w:color="auto"/>
+            </w:tcBorders>
+            <w:shd w:val="clear" w:color="auto" w:fill="FFFFFF"/>
+            <w:tcMar>
+              <w:top w:w="150" w:type="dxa"/>
+              <w:left w:w="210" w:type="dxa"/>
+              <w:bottom w:w="150" w:type="dxa"/>
+              <w:right w:w="210" w:type="dxa"/>
+            </w:tcMar>
+            <w:vAlign w:val="center"/>
+            <w:hideMark/>
+          </w:tcPr>
+          <w:p>
+            <w:pPr>
+              <w:rPr>
+                <w:sz w:val="18"/>
+                <w:szCs w:val="18"/>
+              </w:rPr>
+            </w:pPr>
+            <w:r>
+              <w:rPr>
+                <w:rFonts w:ascii="Segoe UI Emoji" w:hAnsi="Segoe UI Emoji" w:cs="Segoe UI Emoji"/>
+                <w:sz w:val="18"/>
+                <w:szCs w:val="18"/>
+              </w:rPr>
+              <w:t>✅</w:t>
+            </w:r>
+            <w:r>
+              <w:rPr>
+                <w:rFonts w:hint="eastAsia"/>
+                <w:sz w:val="18"/>
+                <w:szCs w:val="18"/>
+              </w:rPr>
+              <w:t> 拍照AI识别：通过拍照AI识别土壤湿度，无需额外传感器</w:t>
+            </w:r>
+          </w:p>
+        </w:tc>
+        <w:tc>
+          <w:tcPr>
+            <w:tcW w:w="3680" w:type="dxa"/>
+            <w:tcBorders>
+              <w:top w:val="single" w:sz="6" w:space="0" w:color="auto"/>
+              <w:left w:val="single" w:sz="6" w:space="0" w:color="auto"/>
+              <w:bottom w:val="single" w:sz="6" w:space="0" w:color="auto"/>
+              <w:right w:val="single" w:sz="6" w:space="0" w:color="auto"/>
+            </w:tcBorders>
+            <w:shd w:val="clear" w:color="auto" w:fill="FFFFFF"/>
+            <w:tcMar>
+              <w:top w:w="150" w:type="dxa"/>
+              <w:left w:w="210" w:type="dxa"/>
+              <w:bottom w:w="150" w:type="dxa"/>
+              <w:right w:w="210" w:type="dxa"/>
+            </w:tcMar>
+            <w:vAlign w:val="center"/>
+            <w:hideMark/>
+          </w:tcPr>
+          <w:p>
+            <w:pPr>
+              <w:rPr>
+                <w:sz w:val="18"/>
+                <w:szCs w:val="18"/>
+              </w:rPr>
+            </w:pPr>
+            <w:r>
+              <w:rPr>
+                <w:rFonts w:ascii="Segoe UI Emoji" w:hAnsi="Segoe UI Emoji" w:cs="Segoe UI Emoji"/>
+                <w:sz w:val="18"/>
+                <w:szCs w:val="18"/>
+              </w:rPr>
+              <w:t>❌</w:t>
+            </w:r>
+            <w:r>
+              <w:rPr>
+                <w:rFonts w:hint="eastAsia"/>
+                <w:sz w:val="18"/>
+                <w:szCs w:val="18"/>
+              </w:rPr>
+              <w:t xml:space="preserve"> 均不支持</w:t>
+            </w:r>
+          </w:p>
+        </w:tc>
+      </w:tr>
+      <w:tr>
+        <w:tc>
+          <w:tcPr>
+            <w:tcW w:w="1410" w:type="dxa"/>
+            <w:tcBorders>
+              <w:top w:val="single" w:sz="6" w:space="0" w:color="auto"/>
+              <w:left w:val="single" w:sz="6" w:space="0" w:color="auto"/>
+              <w:bottom w:val="single" w:sz="6" w:space="0" w:color="auto"/>
+              <w:right w:val="single" w:sz="6" w:space="0" w:color="auto"/>
+            </w:tcBorders>
+            <w:shd w:val="clear" w:color="auto" w:fill="FFFFFF"/>
+            <w:tcMar>
+              <w:top w:w="150" w:type="dxa"/>
+              <w:left w:w="210" w:type="dxa"/>
+              <w:bottom w:w="150" w:type="dxa"/>
+              <w:right w:w="210" w:type="dxa"/>
+            </w:tcMar>
+            <w:vAlign w:val="center"/>
+            <w:hideMark/>
+          </w:tcPr>
+          <w:p>
+            <w:pPr>
+              <w:rPr>
+                <w:sz w:val="18"/>
+                <w:szCs w:val="18"/>
+              </w:rPr>
+            </w:pPr>
+            <w:r>
+              <w:rPr>
+                <w:rFonts w:hint="eastAsia"/>
+                <w:sz w:val="18"/>
+                <w:szCs w:val="18"/>
+              </w:rPr>
+              <w:t>诊断能力</w:t>
+            </w:r>
+          </w:p>
+        </w:tc>
+        <w:tc>
+          <w:tcPr>
+            <w:tcW w:w="3691" w:type="dxa"/>
+            <w:tcBorders>
+              <w:top w:val="single" w:sz="6" w:space="0" w:color="auto"/>
+              <w:left w:val="single" w:sz="6" w:space="0" w:color="auto"/>
+              <w:bottom w:val="single" w:sz="6" w:space="0" w:color="auto"/>
+              <w:right w:val="single" w:sz="6" w:space="0" w:color="auto"/>
+            </w:tcBorders>
+            <w:shd w:val="clear" w:color="auto" w:fill="FFFFFF"/>
+            <w:tcMar>
+              <w:top w:w="150" w:type="dxa"/>
+              <w:left w:w="210" w:type="dxa"/>
+              <w:bottom w:w="150" w:type="dxa"/>
+              <w:right w:w="210" w:type="dxa"/>
+            </w:tcMar>
+            <w:vAlign w:val="center"/>
+            <w:hideMark/>
+          </w:tcPr>
+          <w:p>
+            <w:pPr>
+              <w:rPr>
+                <w:sz w:val="18"/>
+                <w:szCs w:val="18"/>
+              </w:rPr>
+            </w:pPr>
+            <w:r>
+              <w:rPr>
+                <w:rFonts w:ascii="Segoe UI Emoji" w:hAnsi="Segoe UI Emoji" w:cs="Segoe UI Emoji"/>
+                <w:sz w:val="18"/>
+                <w:szCs w:val="18"/>
+              </w:rPr>
+              <w:t>✅</w:t>
+            </w:r>
+            <w:r>
+              <w:rPr>
+                <w:rFonts w:hint="eastAsia"/>
+                <w:sz w:val="18"/>
+                <w:szCs w:val="18"/>
+              </w:rPr>
+              <w:t> AI病害诊断：提供AI诊断+救治方案+专家咨询入口</w:t>
+            </w:r>
+          </w:p>
+        </w:tc>
+        <w:tc>
+          <w:tcPr>
+            <w:tcW w:w="3680" w:type="dxa"/>
+            <w:tcBorders>
+              <w:top w:val="single" w:sz="6" w:space="0" w:color="auto"/>
+              <w:left w:val="single" w:sz="6" w:space="0" w:color="auto"/>
+              <w:bottom w:val="single" w:sz="6" w:space="0" w:color="auto"/>
+              <w:right w:val="single" w:sz="6" w:space="0" w:color="auto"/>
+            </w:tcBorders>
+            <w:shd w:val="clear" w:color="auto" w:fill="FFFFFF"/>
+            <w:tcMar>
+              <w:top w:w="150" w:type="dxa"/>
+              <w:left w:w="210" w:type="dxa"/>
+              <w:bottom w:w="150" w:type="dxa"/>
+              <w:right w:w="210" w:type="dxa"/>
+            </w:tcMar>
+            <w:vAlign w:val="center"/>
+            <w:hideMark/>
+          </w:tcPr>
+          <w:p>
+            <w:pPr>
+              <w:rPr>
+                <w:sz w:val="18"/>
+                <w:szCs w:val="18"/>
+              </w:rPr>
+            </w:pPr>
+            <w:r>
+              <w:rPr>
+                <w:rFonts w:ascii="Segoe UI Emoji" w:hAnsi="Segoe UI Emoji" w:cs="Segoe UI Emoji"/>
+                <w:sz w:val="18"/>
+                <w:szCs w:val="18"/>
+              </w:rPr>
+              <w:t>⚠️</w:t>
+            </w:r>
+            <w:r>
+              <w:rPr>
+                <w:rFonts w:hint="eastAsia"/>
+                <w:sz w:val="18"/>
+                <w:szCs w:val="18"/>
+              </w:rPr>
+              <w:t xml:space="preserve"> 养花大全仅有内容，无AI诊断</w:t>
+            </w:r>
+          </w:p>
+        </w:tc>
+      </w:tr>
+      <w:tr>
+        <w:tc>
+          <w:tcPr>
+            <w:tcW w:w="1410" w:type="dxa"/>
+            <w:tcBorders>
+              <w:top w:val="single" w:sz="6" w:space="0" w:color="auto"/>
+              <w:left w:val="single" w:sz="6" w:space="0" w:color="auto"/>
+              <w:bottom w:val="single" w:sz="6" w:space="0" w:color="auto"/>
+              <w:right w:val="single" w:sz="6" w:space="0" w:color="auto"/>
+            </w:tcBorders>
+            <w:shd w:val="clear" w:color="auto" w:fill="FFFFFF"/>
+            <w:tcMar>
+              <w:top w:w="150" w:type="dxa"/>
+              <w:left w:w="210" w:type="dxa"/>
+              <w:bottom w:w="150" w:type="dxa"/>
+              <w:right w:w="210" w:type="dxa"/>
+            </w:tcMar>
+            <w:vAlign w:val="center"/>
+            <w:hideMark/>
+          </w:tcPr>
+          <w:p>
+            <w:pPr>
+              <w:rPr>
+                <w:sz w:val="18"/>
+                <w:szCs w:val="18"/>
+              </w:rPr>
+            </w:pPr>
+            <w:r>
+              <w:rPr>
+                <w:rFonts w:hint="eastAsia"/>
+                <w:sz w:val="18"/>
+                <w:szCs w:val="18"/>
+              </w:rPr>
+              <w:t>用户体验</w:t>
+            </w:r>
+          </w:p>
+        </w:tc>
+        <w:tc>
+          <w:tcPr>
+            <w:tcW w:w="3691" w:type="dxa"/>
+            <w:tcBorders>
+              <w:top w:val="single" w:sz="6" w:space="0" w:color="auto"/>
+              <w:left w:val="single" w:sz="6" w:space="0" w:color="auto"/>
+              <w:bottom w:val="single" w:sz="6" w:space="0" w:color="auto"/>
+              <w:right w:val="single" w:sz="6" w:space="0" w:color="auto"/>
+            </w:tcBorders>
+            <w:shd w:val="clear" w:color="auto" w:fill="FFFFFF"/>
+            <w:tcMar>
+              <w:top w:w="150" w:type="dxa"/>
+              <w:left w:w="210" w:type="dxa"/>
+              <w:bottom w:w="150" w:type="dxa"/>
+              <w:right w:w="210" w:type="dxa"/>
+            </w:tcMar>
+            <w:vAlign w:val="center"/>
+            <w:hideMark/>
+          </w:tcPr>
+          <w:p>
+            <w:pPr>
+              <w:rPr>
+                <w:sz w:val="18"/>
+                <w:szCs w:val="18"/>
+              </w:rPr>
+            </w:pPr>
+            <w:r>
+              <w:rPr>
+                <w:rFonts w:ascii="Segoe UI Emoji" w:hAnsi="Segoe UI Emoji" w:cs="Segoe UI Emoji"/>
+                <w:sz w:val="18"/>
+                <w:szCs w:val="18"/>
+              </w:rPr>
+              <w:t>✅</w:t>
+            </w:r>
+            <w:r>
+              <w:rPr>
+                <w:rFonts w:hint="eastAsia"/>
+                <w:sz w:val="18"/>
+                <w:szCs w:val="18"/>
+              </w:rPr>
+              <w:t> 简单自动化：用户只需跟着提醒操作，门槛极低</w:t>
+            </w:r>
+          </w:p>
+        </w:tc>
+        <w:tc>
+          <w:tcPr>
+            <w:tcW w:w="3680" w:type="dxa"/>
+            <w:tcBorders>
+              <w:top w:val="single" w:sz="6" w:space="0" w:color="auto"/>
+              <w:left w:val="single" w:sz="6" w:space="0" w:color="auto"/>
+              <w:bottom w:val="single" w:sz="6" w:space="0" w:color="auto"/>
+              <w:right w:val="single" w:sz="6" w:space="0" w:color="auto"/>
+            </w:tcBorders>
+            <w:shd w:val="clear" w:color="auto" w:fill="FFFFFF"/>
+            <w:tcMar>
+              <w:top w:w="150" w:type="dxa"/>
+              <w:left w:w="210" w:type="dxa"/>
+              <w:bottom w:w="150" w:type="dxa"/>
+              <w:right w:w="210" w:type="dxa"/>
+            </w:tcMar>
+            <w:vAlign w:val="center"/>
+            <w:hideMark/>
+          </w:tcPr>
+          <w:p>
+            <w:pPr>
+              <w:rPr>
+                <w:sz w:val="18"/>
+                <w:szCs w:val="18"/>
+              </w:rPr>
+            </w:pPr>
+            <w:r>
+              <w:rPr>
+                <w:rFonts w:ascii="Segoe UI Emoji" w:hAnsi="Segoe UI Emoji" w:cs="Segoe UI Emoji"/>
+                <w:sz w:val="18"/>
+                <w:szCs w:val="18"/>
+              </w:rPr>
+              <w:t>⚠️</w:t>
+            </w:r>
+            <w:r>
+              <w:rPr>
+                <w:rFonts w:hint="eastAsia"/>
+                <w:sz w:val="18"/>
+                <w:szCs w:val="18"/>
+              </w:rPr>
+              <w:t xml:space="preserve"> 需主动搜索学习，使用门槛高</w:t>
+            </w:r>
+          </w:p>
+        </w:tc>
+      </w:tr>
+    </w:tbl>
+    <w:p>
+      <w:pPr>
+        <w:ind w:left="720"/>
+      </w:pPr>
     </w:p>
     <w:p>
       <w:pPr>
@@ -514,7 +1639,22 @@
         <w:t>模型类别：</w:t>
       </w:r>
       <w:r>
-        <w:t xml:space="preserve"> [ ] LLM    [ ] VLM    [ ] Image/</w:t>
+        <w:t xml:space="preserve"> [] LLM    [ </w:t>
+      </w:r>
+      <w:r>
+        <w:rPr>
+          <w:rFonts w:eastAsiaTheme="minorHAnsi"/>
+        </w:rPr>
+        <w:t>*</w:t>
+      </w:r>
+      <w:r>
+        <w:rPr>
+          <w:rFonts w:eastAsiaTheme="minorHAnsi" w:hint="eastAsia"/>
+        </w:rPr>
+        <w:t xml:space="preserve"> </w:t>
+      </w:r>
+      <w:r>
+        <w:t>] VLM    [ ] Image/</w:t>
       </w:r>
       <w:proofErr w:type="spellStart"/>
       <w:r>
@@ -554,7 +1694,22 @@
         </w:numPr>
       </w:pPr>
       <w:r>
-        <w:t>[ ] 纯 API 调用 (Zero-shot / Few-shot)</w:t>
+        <w:t xml:space="preserve">[ </w:t>
+      </w:r>
+      <w:r>
+        <w:rPr>
+          <w:rFonts w:eastAsiaTheme="minorHAnsi"/>
+        </w:rPr>
+        <w:t>*</w:t>
+      </w:r>
+      <w:r>
+        <w:rPr>
+          <w:rFonts w:eastAsiaTheme="minorHAnsi" w:hint="eastAsia"/>
+        </w:rPr>
+        <w:t xml:space="preserve"> </w:t>
+      </w:r>
+      <w:r>
+        <w:t>] 纯 API 调用 (Zero-shot / Few-shot)</w:t>
       </w:r>
     </w:p>
     <w:p>
@@ -565,7 +1720,22 @@
         </w:numPr>
       </w:pPr>
       <w:r>
-        <w:t>[ ] 检索增强生成 (RAG)</w:t>
+        <w:t xml:space="preserve">[ </w:t>
+      </w:r>
+      <w:r>
+        <w:rPr>
+          <w:rFonts w:eastAsiaTheme="minorHAnsi"/>
+        </w:rPr>
+        <w:t>*</w:t>
+      </w:r>
+      <w:r>
+        <w:rPr>
+          <w:rFonts w:eastAsiaTheme="minorHAnsi" w:hint="eastAsia"/>
+        </w:rPr>
+        <w:t xml:space="preserve"> </w:t>
+      </w:r>
+      <w:r>
+        <w:t>] 检索增强生成 (RAG)</w:t>
       </w:r>
     </w:p>
     <w:p>
@@ -587,7 +1757,22 @@
         </w:numPr>
       </w:pPr>
       <w:r>
-        <w:t>[ ] 后训练/强化学习 (Post-Training/RLHF)</w:t>
+        <w:t>[</w:t>
+      </w:r>
+      <w:r>
+        <w:rPr>
+          <w:rFonts w:hint="eastAsia"/>
+        </w:rPr>
+        <w:t xml:space="preserve"> </w:t>
+      </w:r>
+      <w:r>
+        <w:rPr>
+          <w:rFonts w:eastAsiaTheme="minorHAnsi"/>
+        </w:rPr>
+        <w:t>*</w:t>
+      </w:r>
+      <w:r>
+        <w:t xml:space="preserve"> ] 后训练/强化学习 (Post-Training/RLHF)</w:t>
       </w:r>
     </w:p>
     <w:p>
@@ -606,8 +1791,76 @@
       </w:r>
     </w:p>
     <w:p>
+      <w:pPr>
+        <w:rPr>
+          <w:b/>
+          <w:bCs/>
+        </w:rPr>
+      </w:pPr>
+    </w:p>
+    <w:p>
+      <w:pPr>
+        <w:rPr>
+          <w:b/>
+          <w:bCs/>
+        </w:rPr>
+      </w:pPr>
       <w:r>
-        <w:t>[ 请在此处插入系统整体逻辑架构图或UI原型图 ]</w:t>
+        <w:rPr>
+          <w:rFonts w:hint="eastAsia"/>
+          <w:b/>
+          <w:bCs/>
+          <w:noProof/>
+        </w:rPr>
+        <w:lastRenderedPageBreak/>
+        <w:drawing>
+          <wp:inline distT="0" distB="0" distL="0" distR="0" wp14:anchorId="30545660" wp14:editId="53163F10">
+            <wp:extent cx="5262880" cy="5495925"/>
+            <wp:effectExtent l="0" t="0" r="0" b="9525"/>
+            <wp:docPr id="1831012874" name="Picture 3"/>
+            <wp:cNvGraphicFramePr>
+              <a:graphicFrameLocks xmlns:a="http://schemas.openxmlformats.org/drawingml/2006/main" noChangeAspect="1"/>
+            </wp:cNvGraphicFramePr>
+            <a:graphic xmlns:a="http://schemas.openxmlformats.org/drawingml/2006/main">
+              <a:graphicData uri="http://schemas.openxmlformats.org/drawingml/2006/picture">
+                <pic:pic xmlns:pic="http://schemas.openxmlformats.org/drawingml/2006/picture">
+                  <pic:nvPicPr>
+                    <pic:cNvPr id="0" name="Picture 2"/>
+                    <pic:cNvPicPr>
+                      <a:picLocks noChangeAspect="1" noChangeArrowheads="1"/>
+                    </pic:cNvPicPr>
+                  </pic:nvPicPr>
+                  <pic:blipFill>
+                    <a:blip r:embed="rId5" cstate="print">
+                      <a:extLst>
+                        <a:ext uri="{28A0092B-C50C-407E-A947-70E740481C1C}">
+                          <a14:useLocalDpi xmlns:a14="http://schemas.microsoft.com/office/drawing/2010/main" val="0"/>
+                        </a:ext>
+                      </a:extLst>
+                    </a:blip>
+                    <a:srcRect/>
+                    <a:stretch>
+                      <a:fillRect/>
+                    </a:stretch>
+                  </pic:blipFill>
+                  <pic:spPr bwMode="auto">
+                    <a:xfrm>
+                      <a:off x="0" y="0"/>
+                      <a:ext cx="5262880" cy="5495925"/>
+                    </a:xfrm>
+                    <a:prstGeom prst="rect">
+                      <a:avLst/>
+                    </a:prstGeom>
+                    <a:noFill/>
+                    <a:ln>
+                      <a:noFill/>
+                    </a:ln>
+                  </pic:spPr>
+                </pic:pic>
+              </a:graphicData>
+            </a:graphic>
+          </wp:inline>
+        </w:drawing>
       </w:r>
     </w:p>
     <w:p>
@@ -627,7 +1880,9 @@
     </w:p>
     <w:tbl>
       <w:tblPr>
-        <w:tblW w:w="0" w:type="auto"/>
+        <w:tblpPr w:leftFromText="180" w:rightFromText="180" w:vertAnchor="text" w:horzAnchor="page" w:tblpX="1829" w:tblpY="292"/>
+        <w:tblW w:w="5000" w:type="pct"/>
+        <w:shd w:val="clear" w:color="auto" w:fill="FFFFFF"/>
         <w:tblCellMar>
           <w:top w:w="15" w:type="dxa"/>
           <w:left w:w="15" w:type="dxa"/>
@@ -637,177 +1892,1719 @@
         <w:tblLook w:val="04A0" w:firstRow="1" w:lastRow="0" w:firstColumn="1" w:lastColumn="0" w:noHBand="0" w:noVBand="1"/>
       </w:tblPr>
       <w:tblGrid>
-        <w:gridCol w:w="1203"/>
-        <w:gridCol w:w="1203"/>
-        <w:gridCol w:w="1152"/>
+        <w:gridCol w:w="841"/>
+        <w:gridCol w:w="1560"/>
+        <w:gridCol w:w="4538"/>
+        <w:gridCol w:w="1351"/>
       </w:tblGrid>
       <w:tr>
         <w:trPr>
+          <w:trHeight w:val="284"/>
           <w:tblHeader/>
         </w:trPr>
         <w:tc>
           <w:tcPr>
-            <w:tcW w:w="0" w:type="auto"/>
-            <w:tcBorders>
-              <w:top w:val="single" w:sz="6" w:space="0" w:color="000000"/>
-              <w:left w:val="single" w:sz="6" w:space="0" w:color="000000"/>
-              <w:bottom w:val="single" w:sz="6" w:space="0" w:color="000000"/>
-              <w:right w:val="single" w:sz="6" w:space="0" w:color="000000"/>
-            </w:tcBorders>
-            <w:shd w:val="clear" w:color="auto" w:fill="F2F2F2"/>
-            <w:tcMar>
-              <w:top w:w="120" w:type="dxa"/>
-              <w:left w:w="120" w:type="dxa"/>
-              <w:bottom w:w="120" w:type="dxa"/>
-              <w:right w:w="120" w:type="dxa"/>
-            </w:tcMar>
+            <w:tcW w:w="507" w:type="pct"/>
+            <w:tcBorders>
+              <w:top w:val="single" w:sz="6" w:space="0" w:color="auto"/>
+              <w:left w:val="single" w:sz="6" w:space="0" w:color="auto"/>
+              <w:bottom w:val="single" w:sz="6" w:space="0" w:color="auto"/>
+              <w:right w:val="single" w:sz="6" w:space="0" w:color="auto"/>
+            </w:tcBorders>
+            <w:shd w:val="clear" w:color="auto" w:fill="FFFFFF"/>
+            <w:noWrap/>
+            <w:tcMar>
+              <w:top w:w="150" w:type="dxa"/>
+              <w:left w:w="210" w:type="dxa"/>
+              <w:bottom w:w="150" w:type="dxa"/>
+              <w:right w:w="210" w:type="dxa"/>
+            </w:tcMar>
+            <w:vAlign w:val="center"/>
             <w:hideMark/>
           </w:tcPr>
           <w:p>
             <w:pPr>
-              <w:rPr>
+              <w:jc w:val="left"/>
+            </w:pPr>
+            <w:r>
+              <w:rPr>
+                <w:rFonts w:hint="eastAsia"/>
+              </w:rPr>
+              <w:t>序号</w:t>
+            </w:r>
+          </w:p>
+        </w:tc>
+        <w:tc>
+          <w:tcPr>
+            <w:tcW w:w="941" w:type="pct"/>
+            <w:tcBorders>
+              <w:top w:val="single" w:sz="6" w:space="0" w:color="auto"/>
+              <w:left w:val="single" w:sz="6" w:space="0" w:color="auto"/>
+              <w:bottom w:val="single" w:sz="6" w:space="0" w:color="auto"/>
+              <w:right w:val="single" w:sz="6" w:space="0" w:color="auto"/>
+            </w:tcBorders>
+            <w:shd w:val="clear" w:color="auto" w:fill="FFFFFF"/>
+            <w:noWrap/>
+            <w:tcMar>
+              <w:top w:w="150" w:type="dxa"/>
+              <w:left w:w="210" w:type="dxa"/>
+              <w:bottom w:w="150" w:type="dxa"/>
+              <w:right w:w="210" w:type="dxa"/>
+            </w:tcMar>
+            <w:vAlign w:val="center"/>
+            <w:hideMark/>
+          </w:tcPr>
+          <w:p>
+            <w:pPr>
+              <w:jc w:val="left"/>
+              <w:rPr>
+                <w:rFonts w:hint="eastAsia"/>
+              </w:rPr>
+            </w:pPr>
+            <w:r>
+              <w:rPr>
+                <w:rFonts w:hint="eastAsia"/>
+              </w:rPr>
+              <w:t>技术难点</w:t>
+            </w:r>
+          </w:p>
+        </w:tc>
+        <w:tc>
+          <w:tcPr>
+            <w:tcW w:w="2736" w:type="pct"/>
+            <w:tcBorders>
+              <w:top w:val="single" w:sz="6" w:space="0" w:color="auto"/>
+              <w:left w:val="single" w:sz="6" w:space="0" w:color="auto"/>
+              <w:bottom w:val="single" w:sz="6" w:space="0" w:color="auto"/>
+              <w:right w:val="single" w:sz="6" w:space="0" w:color="auto"/>
+            </w:tcBorders>
+            <w:shd w:val="clear" w:color="auto" w:fill="FFFFFF"/>
+            <w:noWrap/>
+            <w:tcMar>
+              <w:top w:w="150" w:type="dxa"/>
+              <w:left w:w="210" w:type="dxa"/>
+              <w:bottom w:w="150" w:type="dxa"/>
+              <w:right w:w="210" w:type="dxa"/>
+            </w:tcMar>
+            <w:vAlign w:val="center"/>
+            <w:hideMark/>
+          </w:tcPr>
+          <w:p>
+            <w:pPr>
+              <w:jc w:val="left"/>
+              <w:rPr>
+                <w:rFonts w:hint="eastAsia"/>
+              </w:rPr>
+            </w:pPr>
+            <w:r>
+              <w:rPr>
+                <w:rFonts w:hint="eastAsia"/>
+              </w:rPr>
+              <w:t>解决思路</w:t>
+            </w:r>
+          </w:p>
+        </w:tc>
+        <w:tc>
+          <w:tcPr>
+            <w:tcW w:w="815" w:type="pct"/>
+            <w:tcBorders>
+              <w:top w:val="single" w:sz="6" w:space="0" w:color="auto"/>
+              <w:left w:val="single" w:sz="6" w:space="0" w:color="auto"/>
+              <w:bottom w:val="single" w:sz="6" w:space="0" w:color="auto"/>
+              <w:right w:val="single" w:sz="6" w:space="0" w:color="auto"/>
+            </w:tcBorders>
+            <w:shd w:val="clear" w:color="auto" w:fill="FFFFFF"/>
+            <w:noWrap/>
+            <w:tcMar>
+              <w:top w:w="150" w:type="dxa"/>
+              <w:left w:w="210" w:type="dxa"/>
+              <w:bottom w:w="150" w:type="dxa"/>
+              <w:right w:w="210" w:type="dxa"/>
+            </w:tcMar>
+            <w:vAlign w:val="center"/>
+            <w:hideMark/>
+          </w:tcPr>
+          <w:p>
+            <w:pPr>
+              <w:jc w:val="left"/>
+              <w:rPr>
+                <w:rFonts w:hint="eastAsia"/>
                 <w:b/>
                 <w:bCs/>
               </w:rPr>
             </w:pPr>
             <w:r>
-              <w:t>技术难点</w:t>
-            </w:r>
-          </w:p>
-        </w:tc>
-        <w:tc>
-          <w:tcPr>
-            <w:tcW w:w="0" w:type="auto"/>
-            <w:tcBorders>
-              <w:top w:val="single" w:sz="6" w:space="0" w:color="000000"/>
-              <w:left w:val="single" w:sz="6" w:space="0" w:color="000000"/>
-              <w:bottom w:val="single" w:sz="6" w:space="0" w:color="000000"/>
-              <w:right w:val="single" w:sz="6" w:space="0" w:color="000000"/>
-            </w:tcBorders>
-            <w:shd w:val="clear" w:color="auto" w:fill="F2F2F2"/>
-            <w:tcMar>
-              <w:top w:w="120" w:type="dxa"/>
-              <w:left w:w="120" w:type="dxa"/>
-              <w:bottom w:w="120" w:type="dxa"/>
-              <w:right w:w="120" w:type="dxa"/>
-            </w:tcMar>
-            <w:hideMark/>
-          </w:tcPr>
-          <w:p>
-            <w:pPr>
-              <w:rPr>
+              <w:rPr>
+                <w:rFonts w:hint="eastAsia"/>
                 <w:b/>
                 <w:bCs/>
               </w:rPr>
+              <w:t>风险等级</w:t>
+            </w:r>
+          </w:p>
+        </w:tc>
+      </w:tr>
+      <w:tr>
+        <w:trPr>
+          <w:trHeight w:val="1152"/>
+        </w:trPr>
+        <w:tc>
+          <w:tcPr>
+            <w:tcW w:w="507" w:type="pct"/>
+            <w:tcBorders>
+              <w:top w:val="single" w:sz="6" w:space="0" w:color="auto"/>
+              <w:left w:val="single" w:sz="6" w:space="0" w:color="auto"/>
+              <w:bottom w:val="single" w:sz="6" w:space="0" w:color="auto"/>
+              <w:right w:val="single" w:sz="6" w:space="0" w:color="auto"/>
+            </w:tcBorders>
+            <w:shd w:val="clear" w:color="auto" w:fill="FFFFFF"/>
+            <w:tcMar>
+              <w:top w:w="150" w:type="dxa"/>
+              <w:left w:w="210" w:type="dxa"/>
+              <w:bottom w:w="150" w:type="dxa"/>
+              <w:right w:w="210" w:type="dxa"/>
+            </w:tcMar>
+            <w:vAlign w:val="center"/>
+            <w:hideMark/>
+          </w:tcPr>
+          <w:p>
+            <w:pPr>
+              <w:rPr>
+                <w:rFonts w:hint="eastAsia"/>
+              </w:rPr>
             </w:pPr>
             <w:r>
-              <w:t>解决方案</w:t>
-            </w:r>
-          </w:p>
-        </w:tc>
-        <w:tc>
-          <w:tcPr>
-            <w:tcW w:w="0" w:type="auto"/>
-            <w:tcBorders>
-              <w:top w:val="single" w:sz="6" w:space="0" w:color="000000"/>
-              <w:left w:val="single" w:sz="6" w:space="0" w:color="000000"/>
-              <w:bottom w:val="single" w:sz="6" w:space="0" w:color="000000"/>
-              <w:right w:val="single" w:sz="6" w:space="0" w:color="000000"/>
-            </w:tcBorders>
-            <w:shd w:val="clear" w:color="auto" w:fill="F2F2F2"/>
-            <w:tcMar>
-              <w:top w:w="120" w:type="dxa"/>
-              <w:left w:w="120" w:type="dxa"/>
-              <w:bottom w:w="120" w:type="dxa"/>
-              <w:right w:w="120" w:type="dxa"/>
-            </w:tcMar>
+              <w:rPr>
+                <w:rFonts w:hint="eastAsia"/>
+              </w:rPr>
+              <w:t>1</w:t>
+            </w:r>
+          </w:p>
+        </w:tc>
+        <w:tc>
+          <w:tcPr>
+            <w:tcW w:w="941" w:type="pct"/>
+            <w:tcBorders>
+              <w:top w:val="single" w:sz="6" w:space="0" w:color="auto"/>
+              <w:left w:val="single" w:sz="6" w:space="0" w:color="auto"/>
+              <w:bottom w:val="single" w:sz="6" w:space="0" w:color="auto"/>
+              <w:right w:val="single" w:sz="6" w:space="0" w:color="auto"/>
+            </w:tcBorders>
+            <w:shd w:val="clear" w:color="auto" w:fill="FFFFFF"/>
+            <w:tcMar>
+              <w:top w:w="150" w:type="dxa"/>
+              <w:left w:w="210" w:type="dxa"/>
+              <w:bottom w:w="150" w:type="dxa"/>
+              <w:right w:w="210" w:type="dxa"/>
+            </w:tcMar>
+            <w:vAlign w:val="center"/>
             <w:hideMark/>
           </w:tcPr>
           <w:p>
             <w:pPr>
               <w:rPr>
+                <w:rFonts w:hint="eastAsia"/>
+              </w:rPr>
+            </w:pPr>
+            <w:r>
+              <w:rPr>
+                <w:rFonts w:hint="eastAsia"/>
+              </w:rPr>
+              <w:t>AI植物识别准确率不足</w:t>
+            </w:r>
+          </w:p>
+        </w:tc>
+        <w:tc>
+          <w:tcPr>
+            <w:tcW w:w="2736" w:type="pct"/>
+            <w:tcBorders>
+              <w:top w:val="single" w:sz="6" w:space="0" w:color="auto"/>
+              <w:left w:val="single" w:sz="6" w:space="0" w:color="auto"/>
+              <w:bottom w:val="single" w:sz="6" w:space="0" w:color="auto"/>
+              <w:right w:val="single" w:sz="6" w:space="0" w:color="auto"/>
+            </w:tcBorders>
+            <w:shd w:val="clear" w:color="auto" w:fill="FFFFFF"/>
+            <w:tcMar>
+              <w:top w:w="150" w:type="dxa"/>
+              <w:left w:w="210" w:type="dxa"/>
+              <w:bottom w:w="150" w:type="dxa"/>
+              <w:right w:w="210" w:type="dxa"/>
+            </w:tcMar>
+            <w:vAlign w:val="center"/>
+            <w:hideMark/>
+          </w:tcPr>
+          <w:p>
+            <w:pPr>
+              <w:rPr>
+                <w:rFonts w:hint="eastAsia"/>
+              </w:rPr>
+            </w:pPr>
+            <w:r>
+              <w:rPr>
+                <w:rFonts w:hint="eastAsia"/>
+              </w:rPr>
+              <w:t>采用"主API+备选API"</w:t>
+            </w:r>
+            <w:proofErr w:type="gramStart"/>
+            <w:r>
+              <w:rPr>
+                <w:rFonts w:hint="eastAsia"/>
+              </w:rPr>
+              <w:t>双供应</w:t>
+            </w:r>
+            <w:proofErr w:type="gramEnd"/>
+            <w:r>
+              <w:rPr>
+                <w:rFonts w:hint="eastAsia"/>
+              </w:rPr>
+              <w:t>商策略（百度为主、阿里为备）；建立用户反馈闭环，收集识别错误的样本持续优化；设定置信度阈值，低于阈值时提示用户确认品种</w:t>
+            </w:r>
+          </w:p>
+        </w:tc>
+        <w:tc>
+          <w:tcPr>
+            <w:tcW w:w="815" w:type="pct"/>
+            <w:tcBorders>
+              <w:top w:val="single" w:sz="6" w:space="0" w:color="auto"/>
+              <w:left w:val="single" w:sz="6" w:space="0" w:color="auto"/>
+              <w:bottom w:val="single" w:sz="6" w:space="0" w:color="auto"/>
+              <w:right w:val="single" w:sz="6" w:space="0" w:color="auto"/>
+            </w:tcBorders>
+            <w:shd w:val="clear" w:color="auto" w:fill="FFFFFF"/>
+            <w:tcMar>
+              <w:top w:w="150" w:type="dxa"/>
+              <w:left w:w="210" w:type="dxa"/>
+              <w:bottom w:w="150" w:type="dxa"/>
+              <w:right w:w="210" w:type="dxa"/>
+            </w:tcMar>
+            <w:vAlign w:val="center"/>
+            <w:hideMark/>
+          </w:tcPr>
+          <w:p>
+            <w:pPr>
+              <w:rPr>
+                <w:rFonts w:hint="eastAsia"/>
                 <w:b/>
                 <w:bCs/>
               </w:rPr>
             </w:pPr>
             <w:r>
-              <w:t>风险评估</w:t>
+              <w:rPr>
+                <w:rFonts w:hint="eastAsia"/>
+                <w:b/>
+                <w:bCs/>
+              </w:rPr>
+              <w:t>中</w:t>
             </w:r>
           </w:p>
         </w:tc>
       </w:tr>
       <w:tr>
-        <w:tc>
-          <w:tcPr>
-            <w:tcW w:w="0" w:type="auto"/>
-            <w:tcBorders>
-              <w:top w:val="single" w:sz="6" w:space="0" w:color="000000"/>
-              <w:left w:val="single" w:sz="6" w:space="0" w:color="000000"/>
-              <w:bottom w:val="single" w:sz="6" w:space="0" w:color="000000"/>
-              <w:right w:val="single" w:sz="6" w:space="0" w:color="000000"/>
-            </w:tcBorders>
-            <w:tcMar>
-              <w:top w:w="120" w:type="dxa"/>
-              <w:left w:w="120" w:type="dxa"/>
-              <w:bottom w:w="120" w:type="dxa"/>
-              <w:right w:w="120" w:type="dxa"/>
-            </w:tcMar>
-            <w:hideMark/>
-          </w:tcPr>
-          <w:p>
-            <w:r>
-              <w:t>[描述难点]</w:t>
-            </w:r>
-          </w:p>
-        </w:tc>
-        <w:tc>
-          <w:tcPr>
-            <w:tcW w:w="0" w:type="auto"/>
-            <w:tcBorders>
-              <w:top w:val="single" w:sz="6" w:space="0" w:color="000000"/>
-              <w:left w:val="single" w:sz="6" w:space="0" w:color="000000"/>
-              <w:bottom w:val="single" w:sz="6" w:space="0" w:color="000000"/>
-              <w:right w:val="single" w:sz="6" w:space="0" w:color="000000"/>
-            </w:tcBorders>
-            <w:tcMar>
-              <w:top w:w="120" w:type="dxa"/>
-              <w:left w:w="120" w:type="dxa"/>
-              <w:bottom w:w="120" w:type="dxa"/>
-              <w:right w:w="120" w:type="dxa"/>
-            </w:tcMar>
-            <w:hideMark/>
-          </w:tcPr>
-          <w:p>
-            <w:r>
-              <w:t>[描述思路]</w:t>
-            </w:r>
-          </w:p>
-        </w:tc>
-        <w:tc>
-          <w:tcPr>
-            <w:tcW w:w="0" w:type="auto"/>
-            <w:tcBorders>
-              <w:top w:val="single" w:sz="6" w:space="0" w:color="000000"/>
-              <w:left w:val="single" w:sz="6" w:space="0" w:color="000000"/>
-              <w:bottom w:val="single" w:sz="6" w:space="0" w:color="000000"/>
-              <w:right w:val="single" w:sz="6" w:space="0" w:color="000000"/>
-            </w:tcBorders>
-            <w:tcMar>
-              <w:top w:w="120" w:type="dxa"/>
-              <w:left w:w="120" w:type="dxa"/>
-              <w:bottom w:w="120" w:type="dxa"/>
-              <w:right w:w="120" w:type="dxa"/>
-            </w:tcMar>
-            <w:hideMark/>
-          </w:tcPr>
-          <w:p>
-            <w:r>
-              <w:t>[低/中/高]</w:t>
+        <w:trPr>
+          <w:trHeight w:val="1437"/>
+        </w:trPr>
+        <w:tc>
+          <w:tcPr>
+            <w:tcW w:w="507" w:type="pct"/>
+            <w:tcBorders>
+              <w:top w:val="single" w:sz="6" w:space="0" w:color="auto"/>
+              <w:left w:val="single" w:sz="6" w:space="0" w:color="auto"/>
+              <w:bottom w:val="single" w:sz="6" w:space="0" w:color="auto"/>
+              <w:right w:val="single" w:sz="6" w:space="0" w:color="auto"/>
+            </w:tcBorders>
+            <w:shd w:val="clear" w:color="auto" w:fill="FFFFFF"/>
+            <w:tcMar>
+              <w:top w:w="150" w:type="dxa"/>
+              <w:left w:w="210" w:type="dxa"/>
+              <w:bottom w:w="150" w:type="dxa"/>
+              <w:right w:w="210" w:type="dxa"/>
+            </w:tcMar>
+            <w:vAlign w:val="center"/>
+            <w:hideMark/>
+          </w:tcPr>
+          <w:p>
+            <w:pPr>
+              <w:rPr>
+                <w:rFonts w:hint="eastAsia"/>
+              </w:rPr>
+            </w:pPr>
+            <w:r>
+              <w:rPr>
+                <w:rFonts w:hint="eastAsia"/>
+              </w:rPr>
+              <w:t>2</w:t>
+            </w:r>
+          </w:p>
+        </w:tc>
+        <w:tc>
+          <w:tcPr>
+            <w:tcW w:w="941" w:type="pct"/>
+            <w:tcBorders>
+              <w:top w:val="single" w:sz="6" w:space="0" w:color="auto"/>
+              <w:left w:val="single" w:sz="6" w:space="0" w:color="auto"/>
+              <w:bottom w:val="single" w:sz="6" w:space="0" w:color="auto"/>
+              <w:right w:val="single" w:sz="6" w:space="0" w:color="auto"/>
+            </w:tcBorders>
+            <w:shd w:val="clear" w:color="auto" w:fill="FFFFFF"/>
+            <w:tcMar>
+              <w:top w:w="150" w:type="dxa"/>
+              <w:left w:w="210" w:type="dxa"/>
+              <w:bottom w:w="150" w:type="dxa"/>
+              <w:right w:w="210" w:type="dxa"/>
+            </w:tcMar>
+            <w:vAlign w:val="center"/>
+            <w:hideMark/>
+          </w:tcPr>
+          <w:p>
+            <w:pPr>
+              <w:rPr>
+                <w:rFonts w:hint="eastAsia"/>
+              </w:rPr>
+            </w:pPr>
+            <w:r>
+              <w:rPr>
+                <w:rFonts w:hint="eastAsia"/>
+              </w:rPr>
+              <w:t>土壤湿度识别准确率低（纯视觉）</w:t>
+            </w:r>
+          </w:p>
+        </w:tc>
+        <w:tc>
+          <w:tcPr>
+            <w:tcW w:w="2736" w:type="pct"/>
+            <w:tcBorders>
+              <w:top w:val="single" w:sz="6" w:space="0" w:color="auto"/>
+              <w:left w:val="single" w:sz="6" w:space="0" w:color="auto"/>
+              <w:bottom w:val="single" w:sz="6" w:space="0" w:color="auto"/>
+              <w:right w:val="single" w:sz="6" w:space="0" w:color="auto"/>
+            </w:tcBorders>
+            <w:shd w:val="clear" w:color="auto" w:fill="FFFFFF"/>
+            <w:tcMar>
+              <w:top w:w="150" w:type="dxa"/>
+              <w:left w:w="210" w:type="dxa"/>
+              <w:bottom w:w="150" w:type="dxa"/>
+              <w:right w:w="210" w:type="dxa"/>
+            </w:tcMar>
+            <w:vAlign w:val="center"/>
+            <w:hideMark/>
+          </w:tcPr>
+          <w:p>
+            <w:pPr>
+              <w:rPr>
+                <w:rFonts w:hint="eastAsia"/>
+              </w:rPr>
+            </w:pPr>
+            <w:r>
+              <w:rPr>
+                <w:rFonts w:hint="eastAsia"/>
+              </w:rPr>
+              <w:t>短期内使用百度</w:t>
+            </w:r>
+            <w:proofErr w:type="spellStart"/>
+            <w:r>
+              <w:rPr>
+                <w:rFonts w:hint="eastAsia"/>
+              </w:rPr>
+              <w:t>EasyDL</w:t>
+            </w:r>
+            <w:proofErr w:type="spellEnd"/>
+            <w:r>
+              <w:rPr>
+                <w:rFonts w:hint="eastAsia"/>
+              </w:rPr>
+              <w:t>图像分类模型，结合颜色+纹理特征提取；中长期积累用户标记数据，</w:t>
+            </w:r>
+            <w:proofErr w:type="gramStart"/>
+            <w:r>
+              <w:rPr>
+                <w:rFonts w:hint="eastAsia"/>
+              </w:rPr>
+              <w:t>自训练</w:t>
+            </w:r>
+            <w:proofErr w:type="gramEnd"/>
+            <w:r>
+              <w:rPr>
+                <w:rFonts w:hint="eastAsia"/>
+              </w:rPr>
+              <w:t>专用土壤湿度分类模型；将识别结果作为辅助参考而非绝对依据，配合用户反馈持续优化</w:t>
+            </w:r>
+          </w:p>
+        </w:tc>
+        <w:tc>
+          <w:tcPr>
+            <w:tcW w:w="815" w:type="pct"/>
+            <w:tcBorders>
+              <w:top w:val="single" w:sz="6" w:space="0" w:color="auto"/>
+              <w:left w:val="single" w:sz="6" w:space="0" w:color="auto"/>
+              <w:bottom w:val="single" w:sz="6" w:space="0" w:color="auto"/>
+              <w:right w:val="single" w:sz="6" w:space="0" w:color="auto"/>
+            </w:tcBorders>
+            <w:shd w:val="clear" w:color="auto" w:fill="FFFFFF"/>
+            <w:tcMar>
+              <w:top w:w="150" w:type="dxa"/>
+              <w:left w:w="210" w:type="dxa"/>
+              <w:bottom w:w="150" w:type="dxa"/>
+              <w:right w:w="210" w:type="dxa"/>
+            </w:tcMar>
+            <w:vAlign w:val="center"/>
+            <w:hideMark/>
+          </w:tcPr>
+          <w:p>
+            <w:pPr>
+              <w:rPr>
+                <w:rFonts w:hint="eastAsia"/>
+                <w:b/>
+                <w:bCs/>
+              </w:rPr>
+            </w:pPr>
+            <w:r>
+              <w:rPr>
+                <w:rFonts w:hint="eastAsia"/>
+                <w:b/>
+                <w:bCs/>
+              </w:rPr>
+              <w:t>中</w:t>
+            </w:r>
+          </w:p>
+        </w:tc>
+      </w:tr>
+      <w:tr>
+        <w:trPr>
+          <w:trHeight w:val="284"/>
+        </w:trPr>
+        <w:tc>
+          <w:tcPr>
+            <w:tcW w:w="507" w:type="pct"/>
+            <w:tcBorders>
+              <w:top w:val="single" w:sz="6" w:space="0" w:color="auto"/>
+              <w:left w:val="single" w:sz="6" w:space="0" w:color="auto"/>
+              <w:bottom w:val="single" w:sz="6" w:space="0" w:color="auto"/>
+              <w:right w:val="single" w:sz="6" w:space="0" w:color="auto"/>
+            </w:tcBorders>
+            <w:shd w:val="clear" w:color="auto" w:fill="FFFFFF"/>
+            <w:tcMar>
+              <w:top w:w="150" w:type="dxa"/>
+              <w:left w:w="210" w:type="dxa"/>
+              <w:bottom w:w="150" w:type="dxa"/>
+              <w:right w:w="210" w:type="dxa"/>
+            </w:tcMar>
+            <w:vAlign w:val="center"/>
+            <w:hideMark/>
+          </w:tcPr>
+          <w:p>
+            <w:pPr>
+              <w:rPr>
+                <w:rFonts w:hint="eastAsia"/>
+              </w:rPr>
+            </w:pPr>
+            <w:r>
+              <w:rPr>
+                <w:rFonts w:hint="eastAsia"/>
+              </w:rPr>
+              <w:lastRenderedPageBreak/>
+              <w:t>3</w:t>
+            </w:r>
+          </w:p>
+        </w:tc>
+        <w:tc>
+          <w:tcPr>
+            <w:tcW w:w="941" w:type="pct"/>
+            <w:tcBorders>
+              <w:top w:val="single" w:sz="6" w:space="0" w:color="auto"/>
+              <w:left w:val="single" w:sz="6" w:space="0" w:color="auto"/>
+              <w:bottom w:val="single" w:sz="6" w:space="0" w:color="auto"/>
+              <w:right w:val="single" w:sz="6" w:space="0" w:color="auto"/>
+            </w:tcBorders>
+            <w:shd w:val="clear" w:color="auto" w:fill="FFFFFF"/>
+            <w:tcMar>
+              <w:top w:w="150" w:type="dxa"/>
+              <w:left w:w="210" w:type="dxa"/>
+              <w:bottom w:w="150" w:type="dxa"/>
+              <w:right w:w="210" w:type="dxa"/>
+            </w:tcMar>
+            <w:vAlign w:val="center"/>
+            <w:hideMark/>
+          </w:tcPr>
+          <w:p>
+            <w:pPr>
+              <w:rPr>
+                <w:rFonts w:hint="eastAsia"/>
+              </w:rPr>
+            </w:pPr>
+            <w:r>
+              <w:rPr>
+                <w:rFonts w:hint="eastAsia"/>
+              </w:rPr>
+              <w:t>病害诊断能力有限</w:t>
+            </w:r>
+          </w:p>
+        </w:tc>
+        <w:tc>
+          <w:tcPr>
+            <w:tcW w:w="2736" w:type="pct"/>
+            <w:tcBorders>
+              <w:top w:val="single" w:sz="6" w:space="0" w:color="auto"/>
+              <w:left w:val="single" w:sz="6" w:space="0" w:color="auto"/>
+              <w:bottom w:val="single" w:sz="6" w:space="0" w:color="auto"/>
+              <w:right w:val="single" w:sz="6" w:space="0" w:color="auto"/>
+            </w:tcBorders>
+            <w:shd w:val="clear" w:color="auto" w:fill="FFFFFF"/>
+            <w:tcMar>
+              <w:top w:w="150" w:type="dxa"/>
+              <w:left w:w="210" w:type="dxa"/>
+              <w:bottom w:w="150" w:type="dxa"/>
+              <w:right w:w="210" w:type="dxa"/>
+            </w:tcMar>
+            <w:vAlign w:val="center"/>
+            <w:hideMark/>
+          </w:tcPr>
+          <w:p>
+            <w:pPr>
+              <w:rPr>
+                <w:rFonts w:hint="eastAsia"/>
+              </w:rPr>
+            </w:pPr>
+            <w:r>
+              <w:rPr>
+                <w:rFonts w:hint="eastAsia"/>
+              </w:rPr>
+              <w:t>接入</w:t>
+            </w:r>
+            <w:proofErr w:type="gramStart"/>
+            <w:r>
+              <w:rPr>
+                <w:rFonts w:hint="eastAsia"/>
+              </w:rPr>
+              <w:t>通义千问</w:t>
+            </w:r>
+            <w:proofErr w:type="gramEnd"/>
+            <w:r>
+              <w:rPr>
+                <w:rFonts w:hint="eastAsia"/>
+              </w:rPr>
+              <w:t>/文心大模型进行症状理解和知识库匹配；建立常见病害知识库覆盖Top 20病害；设置专家咨询入口处理疑难杂症；通过用户反馈数据迭代诊断准确率</w:t>
+            </w:r>
+          </w:p>
+        </w:tc>
+        <w:tc>
+          <w:tcPr>
+            <w:tcW w:w="815" w:type="pct"/>
+            <w:tcBorders>
+              <w:top w:val="single" w:sz="6" w:space="0" w:color="auto"/>
+              <w:left w:val="single" w:sz="6" w:space="0" w:color="auto"/>
+              <w:bottom w:val="single" w:sz="6" w:space="0" w:color="auto"/>
+              <w:right w:val="single" w:sz="6" w:space="0" w:color="auto"/>
+            </w:tcBorders>
+            <w:shd w:val="clear" w:color="auto" w:fill="FFFFFF"/>
+            <w:tcMar>
+              <w:top w:w="150" w:type="dxa"/>
+              <w:left w:w="210" w:type="dxa"/>
+              <w:bottom w:w="150" w:type="dxa"/>
+              <w:right w:w="210" w:type="dxa"/>
+            </w:tcMar>
+            <w:vAlign w:val="center"/>
+            <w:hideMark/>
+          </w:tcPr>
+          <w:p>
+            <w:pPr>
+              <w:rPr>
+                <w:rFonts w:hint="eastAsia"/>
+                <w:b/>
+                <w:bCs/>
+              </w:rPr>
+            </w:pPr>
+            <w:r>
+              <w:rPr>
+                <w:rFonts w:hint="eastAsia"/>
+                <w:b/>
+                <w:bCs/>
+              </w:rPr>
+              <w:t>中</w:t>
+            </w:r>
+          </w:p>
+        </w:tc>
+      </w:tr>
+      <w:tr>
+        <w:trPr>
+          <w:trHeight w:val="133"/>
+        </w:trPr>
+        <w:tc>
+          <w:tcPr>
+            <w:tcW w:w="507" w:type="pct"/>
+            <w:tcBorders>
+              <w:top w:val="single" w:sz="6" w:space="0" w:color="auto"/>
+              <w:left w:val="single" w:sz="6" w:space="0" w:color="auto"/>
+              <w:bottom w:val="single" w:sz="6" w:space="0" w:color="auto"/>
+              <w:right w:val="single" w:sz="6" w:space="0" w:color="auto"/>
+            </w:tcBorders>
+            <w:shd w:val="clear" w:color="auto" w:fill="FFFFFF"/>
+            <w:tcMar>
+              <w:top w:w="150" w:type="dxa"/>
+              <w:left w:w="210" w:type="dxa"/>
+              <w:bottom w:w="150" w:type="dxa"/>
+              <w:right w:w="210" w:type="dxa"/>
+            </w:tcMar>
+            <w:vAlign w:val="center"/>
+            <w:hideMark/>
+          </w:tcPr>
+          <w:p>
+            <w:pPr>
+              <w:rPr>
+                <w:rFonts w:hint="eastAsia"/>
+              </w:rPr>
+            </w:pPr>
+            <w:r>
+              <w:rPr>
+                <w:rFonts w:hint="eastAsia"/>
+              </w:rPr>
+              <w:t>4</w:t>
+            </w:r>
+          </w:p>
+        </w:tc>
+        <w:tc>
+          <w:tcPr>
+            <w:tcW w:w="941" w:type="pct"/>
+            <w:tcBorders>
+              <w:top w:val="single" w:sz="6" w:space="0" w:color="auto"/>
+              <w:left w:val="single" w:sz="6" w:space="0" w:color="auto"/>
+              <w:bottom w:val="single" w:sz="6" w:space="0" w:color="auto"/>
+              <w:right w:val="single" w:sz="6" w:space="0" w:color="auto"/>
+            </w:tcBorders>
+            <w:shd w:val="clear" w:color="auto" w:fill="FFFFFF"/>
+            <w:tcMar>
+              <w:top w:w="150" w:type="dxa"/>
+              <w:left w:w="210" w:type="dxa"/>
+              <w:bottom w:w="150" w:type="dxa"/>
+              <w:right w:w="210" w:type="dxa"/>
+            </w:tcMar>
+            <w:vAlign w:val="center"/>
+            <w:hideMark/>
+          </w:tcPr>
+          <w:p>
+            <w:pPr>
+              <w:rPr>
+                <w:rFonts w:hint="eastAsia"/>
+              </w:rPr>
+            </w:pPr>
+            <w:r>
+              <w:rPr>
+                <w:rFonts w:hint="eastAsia"/>
+              </w:rPr>
+              <w:t>动态提醒算法调优</w:t>
+            </w:r>
+          </w:p>
+        </w:tc>
+        <w:tc>
+          <w:tcPr>
+            <w:tcW w:w="2736" w:type="pct"/>
+            <w:tcBorders>
+              <w:top w:val="single" w:sz="6" w:space="0" w:color="auto"/>
+              <w:left w:val="single" w:sz="6" w:space="0" w:color="auto"/>
+              <w:bottom w:val="single" w:sz="6" w:space="0" w:color="auto"/>
+              <w:right w:val="single" w:sz="6" w:space="0" w:color="auto"/>
+            </w:tcBorders>
+            <w:shd w:val="clear" w:color="auto" w:fill="FFFFFF"/>
+            <w:tcMar>
+              <w:top w:w="150" w:type="dxa"/>
+              <w:left w:w="210" w:type="dxa"/>
+              <w:bottom w:w="150" w:type="dxa"/>
+              <w:right w:w="210" w:type="dxa"/>
+            </w:tcMar>
+            <w:vAlign w:val="center"/>
+            <w:hideMark/>
+          </w:tcPr>
+          <w:p>
+            <w:pPr>
+              <w:rPr>
+                <w:rFonts w:hint="eastAsia"/>
+              </w:rPr>
+            </w:pPr>
+            <w:r>
+              <w:rPr>
+                <w:rFonts w:hint="eastAsia"/>
+              </w:rPr>
+              <w:t>设计可配置的提醒权重系数表，支持运营后台调整参数；建立用户反馈学习机制（跳过→延长间隔、完成→正常、提前→缩短间隔）；A/B测试验证算法效果，3个月快速迭代优化</w:t>
+            </w:r>
+          </w:p>
+        </w:tc>
+        <w:tc>
+          <w:tcPr>
+            <w:tcW w:w="815" w:type="pct"/>
+            <w:tcBorders>
+              <w:top w:val="single" w:sz="6" w:space="0" w:color="auto"/>
+              <w:left w:val="single" w:sz="6" w:space="0" w:color="auto"/>
+              <w:bottom w:val="single" w:sz="6" w:space="0" w:color="auto"/>
+              <w:right w:val="single" w:sz="6" w:space="0" w:color="auto"/>
+            </w:tcBorders>
+            <w:shd w:val="clear" w:color="auto" w:fill="FFFFFF"/>
+            <w:tcMar>
+              <w:top w:w="150" w:type="dxa"/>
+              <w:left w:w="210" w:type="dxa"/>
+              <w:bottom w:w="150" w:type="dxa"/>
+              <w:right w:w="210" w:type="dxa"/>
+            </w:tcMar>
+            <w:vAlign w:val="center"/>
+            <w:hideMark/>
+          </w:tcPr>
+          <w:p>
+            <w:pPr>
+              <w:rPr>
+                <w:rFonts w:hint="eastAsia"/>
+                <w:b/>
+                <w:bCs/>
+              </w:rPr>
+            </w:pPr>
+            <w:r>
+              <w:rPr>
+                <w:rFonts w:hint="eastAsia"/>
+                <w:b/>
+                <w:bCs/>
+              </w:rPr>
+              <w:t>中</w:t>
+            </w:r>
+          </w:p>
+        </w:tc>
+      </w:tr>
+      <w:tr>
+        <w:trPr>
+          <w:trHeight w:val="133"/>
+        </w:trPr>
+        <w:tc>
+          <w:tcPr>
+            <w:tcW w:w="507" w:type="pct"/>
+            <w:tcBorders>
+              <w:top w:val="single" w:sz="6" w:space="0" w:color="auto"/>
+              <w:left w:val="single" w:sz="6" w:space="0" w:color="auto"/>
+              <w:bottom w:val="single" w:sz="6" w:space="0" w:color="auto"/>
+              <w:right w:val="single" w:sz="6" w:space="0" w:color="auto"/>
+            </w:tcBorders>
+            <w:shd w:val="clear" w:color="auto" w:fill="FFFFFF"/>
+            <w:tcMar>
+              <w:top w:w="150" w:type="dxa"/>
+              <w:left w:w="210" w:type="dxa"/>
+              <w:bottom w:w="150" w:type="dxa"/>
+              <w:right w:w="210" w:type="dxa"/>
+            </w:tcMar>
+            <w:vAlign w:val="center"/>
+            <w:hideMark/>
+          </w:tcPr>
+          <w:p>
+            <w:pPr>
+              <w:rPr>
+                <w:rFonts w:hint="eastAsia"/>
+              </w:rPr>
+            </w:pPr>
+            <w:r>
+              <w:rPr>
+                <w:rFonts w:hint="eastAsia"/>
+              </w:rPr>
+              <w:t>5</w:t>
+            </w:r>
+          </w:p>
+        </w:tc>
+        <w:tc>
+          <w:tcPr>
+            <w:tcW w:w="941" w:type="pct"/>
+            <w:tcBorders>
+              <w:top w:val="single" w:sz="6" w:space="0" w:color="auto"/>
+              <w:left w:val="single" w:sz="6" w:space="0" w:color="auto"/>
+              <w:bottom w:val="single" w:sz="6" w:space="0" w:color="auto"/>
+              <w:right w:val="single" w:sz="6" w:space="0" w:color="auto"/>
+            </w:tcBorders>
+            <w:shd w:val="clear" w:color="auto" w:fill="FFFFFF"/>
+            <w:tcMar>
+              <w:top w:w="150" w:type="dxa"/>
+              <w:left w:w="210" w:type="dxa"/>
+              <w:bottom w:w="150" w:type="dxa"/>
+              <w:right w:w="210" w:type="dxa"/>
+            </w:tcMar>
+            <w:vAlign w:val="center"/>
+            <w:hideMark/>
+          </w:tcPr>
+          <w:p>
+            <w:pPr>
+              <w:rPr>
+                <w:rFonts w:hint="eastAsia"/>
+              </w:rPr>
+            </w:pPr>
+            <w:r>
+              <w:rPr>
+                <w:rFonts w:hint="eastAsia"/>
+              </w:rPr>
+              <w:t>天气API依赖与数据准确性</w:t>
+            </w:r>
+          </w:p>
+        </w:tc>
+        <w:tc>
+          <w:tcPr>
+            <w:tcW w:w="2736" w:type="pct"/>
+            <w:tcBorders>
+              <w:top w:val="single" w:sz="6" w:space="0" w:color="auto"/>
+              <w:left w:val="single" w:sz="6" w:space="0" w:color="auto"/>
+              <w:bottom w:val="single" w:sz="6" w:space="0" w:color="auto"/>
+              <w:right w:val="single" w:sz="6" w:space="0" w:color="auto"/>
+            </w:tcBorders>
+            <w:shd w:val="clear" w:color="auto" w:fill="FFFFFF"/>
+            <w:tcMar>
+              <w:top w:w="150" w:type="dxa"/>
+              <w:left w:w="210" w:type="dxa"/>
+              <w:bottom w:w="150" w:type="dxa"/>
+              <w:right w:w="210" w:type="dxa"/>
+            </w:tcMar>
+            <w:vAlign w:val="center"/>
+            <w:hideMark/>
+          </w:tcPr>
+          <w:p>
+            <w:pPr>
+              <w:rPr>
+                <w:rFonts w:hint="eastAsia"/>
+              </w:rPr>
+            </w:pPr>
+            <w:r>
+              <w:rPr>
+                <w:rFonts w:hint="eastAsia"/>
+              </w:rPr>
+              <w:t>心知天气免费版作为主数据源，日调用量控制在免费额度内；缓存天气数据至Redis，每天更新一次，减少重复调用；用户可手动设置室内环境参数作为兜底；多城市支持预缓存未来7天天气</w:t>
+            </w:r>
+          </w:p>
+        </w:tc>
+        <w:tc>
+          <w:tcPr>
+            <w:tcW w:w="815" w:type="pct"/>
+            <w:tcBorders>
+              <w:top w:val="single" w:sz="6" w:space="0" w:color="auto"/>
+              <w:left w:val="single" w:sz="6" w:space="0" w:color="auto"/>
+              <w:bottom w:val="single" w:sz="6" w:space="0" w:color="auto"/>
+              <w:right w:val="single" w:sz="6" w:space="0" w:color="auto"/>
+            </w:tcBorders>
+            <w:shd w:val="clear" w:color="auto" w:fill="FFFFFF"/>
+            <w:tcMar>
+              <w:top w:w="150" w:type="dxa"/>
+              <w:left w:w="210" w:type="dxa"/>
+              <w:bottom w:w="150" w:type="dxa"/>
+              <w:right w:w="210" w:type="dxa"/>
+            </w:tcMar>
+            <w:vAlign w:val="center"/>
+            <w:hideMark/>
+          </w:tcPr>
+          <w:p>
+            <w:pPr>
+              <w:rPr>
+                <w:rFonts w:hint="eastAsia"/>
+                <w:b/>
+                <w:bCs/>
+              </w:rPr>
+            </w:pPr>
+            <w:r>
+              <w:rPr>
+                <w:rFonts w:hint="eastAsia"/>
+                <w:b/>
+                <w:bCs/>
+              </w:rPr>
+              <w:t>低</w:t>
+            </w:r>
+          </w:p>
+        </w:tc>
+      </w:tr>
+      <w:tr>
+        <w:trPr>
+          <w:trHeight w:val="133"/>
+        </w:trPr>
+        <w:tc>
+          <w:tcPr>
+            <w:tcW w:w="507" w:type="pct"/>
+            <w:tcBorders>
+              <w:top w:val="single" w:sz="6" w:space="0" w:color="auto"/>
+              <w:left w:val="single" w:sz="6" w:space="0" w:color="auto"/>
+              <w:bottom w:val="single" w:sz="6" w:space="0" w:color="auto"/>
+              <w:right w:val="single" w:sz="6" w:space="0" w:color="auto"/>
+            </w:tcBorders>
+            <w:shd w:val="clear" w:color="auto" w:fill="FFFFFF"/>
+            <w:tcMar>
+              <w:top w:w="150" w:type="dxa"/>
+              <w:left w:w="210" w:type="dxa"/>
+              <w:bottom w:w="150" w:type="dxa"/>
+              <w:right w:w="210" w:type="dxa"/>
+            </w:tcMar>
+            <w:vAlign w:val="center"/>
+            <w:hideMark/>
+          </w:tcPr>
+          <w:p>
+            <w:pPr>
+              <w:rPr>
+                <w:rFonts w:hint="eastAsia"/>
+              </w:rPr>
+            </w:pPr>
+            <w:r>
+              <w:rPr>
+                <w:rFonts w:hint="eastAsia"/>
+              </w:rPr>
+              <w:t>6</w:t>
+            </w:r>
+          </w:p>
+        </w:tc>
+        <w:tc>
+          <w:tcPr>
+            <w:tcW w:w="941" w:type="pct"/>
+            <w:tcBorders>
+              <w:top w:val="single" w:sz="6" w:space="0" w:color="auto"/>
+              <w:left w:val="single" w:sz="6" w:space="0" w:color="auto"/>
+              <w:bottom w:val="single" w:sz="6" w:space="0" w:color="auto"/>
+              <w:right w:val="single" w:sz="6" w:space="0" w:color="auto"/>
+            </w:tcBorders>
+            <w:shd w:val="clear" w:color="auto" w:fill="FFFFFF"/>
+            <w:tcMar>
+              <w:top w:w="150" w:type="dxa"/>
+              <w:left w:w="210" w:type="dxa"/>
+              <w:bottom w:w="150" w:type="dxa"/>
+              <w:right w:w="210" w:type="dxa"/>
+            </w:tcMar>
+            <w:vAlign w:val="center"/>
+            <w:hideMark/>
+          </w:tcPr>
+          <w:p>
+            <w:pPr>
+              <w:rPr>
+                <w:rFonts w:hint="eastAsia"/>
+              </w:rPr>
+            </w:pPr>
+            <w:r>
+              <w:rPr>
+                <w:rFonts w:hint="eastAsia"/>
+              </w:rPr>
+              <w:t>v2.0智能硬件研发周期长</w:t>
+            </w:r>
+          </w:p>
+        </w:tc>
+        <w:tc>
+          <w:tcPr>
+            <w:tcW w:w="2736" w:type="pct"/>
+            <w:tcBorders>
+              <w:top w:val="single" w:sz="6" w:space="0" w:color="auto"/>
+              <w:left w:val="single" w:sz="6" w:space="0" w:color="auto"/>
+              <w:bottom w:val="single" w:sz="6" w:space="0" w:color="auto"/>
+              <w:right w:val="single" w:sz="6" w:space="0" w:color="auto"/>
+            </w:tcBorders>
+            <w:shd w:val="clear" w:color="auto" w:fill="FFFFFF"/>
+            <w:tcMar>
+              <w:top w:w="150" w:type="dxa"/>
+              <w:left w:w="210" w:type="dxa"/>
+              <w:bottom w:w="150" w:type="dxa"/>
+              <w:right w:w="210" w:type="dxa"/>
+            </w:tcMar>
+            <w:vAlign w:val="center"/>
+            <w:hideMark/>
+          </w:tcPr>
+          <w:p>
+            <w:pPr>
+              <w:rPr>
+                <w:rFonts w:hint="eastAsia"/>
+              </w:rPr>
+            </w:pPr>
+            <w:r>
+              <w:rPr>
+                <w:rFonts w:hint="eastAsia"/>
+              </w:rPr>
+              <w:t>MVP阶段纯软件验证用户需求，硬件作为第二阶段；选择成熟方案（ESP32+成熟传感器组合），降低研发风险；考虑代工生产（OEM）作为早期备选，降低量产门槛</w:t>
+            </w:r>
+          </w:p>
+        </w:tc>
+        <w:tc>
+          <w:tcPr>
+            <w:tcW w:w="815" w:type="pct"/>
+            <w:tcBorders>
+              <w:top w:val="single" w:sz="6" w:space="0" w:color="auto"/>
+              <w:left w:val="single" w:sz="6" w:space="0" w:color="auto"/>
+              <w:bottom w:val="single" w:sz="6" w:space="0" w:color="auto"/>
+              <w:right w:val="single" w:sz="6" w:space="0" w:color="auto"/>
+            </w:tcBorders>
+            <w:shd w:val="clear" w:color="auto" w:fill="FFFFFF"/>
+            <w:tcMar>
+              <w:top w:w="150" w:type="dxa"/>
+              <w:left w:w="210" w:type="dxa"/>
+              <w:bottom w:w="150" w:type="dxa"/>
+              <w:right w:w="210" w:type="dxa"/>
+            </w:tcMar>
+            <w:vAlign w:val="center"/>
+            <w:hideMark/>
+          </w:tcPr>
+          <w:p>
+            <w:pPr>
+              <w:rPr>
+                <w:rFonts w:hint="eastAsia"/>
+                <w:b/>
+                <w:bCs/>
+              </w:rPr>
+            </w:pPr>
+            <w:r>
+              <w:rPr>
+                <w:rFonts w:hint="eastAsia"/>
+                <w:b/>
+                <w:bCs/>
+              </w:rPr>
+              <w:t>高</w:t>
+            </w:r>
+          </w:p>
+        </w:tc>
+      </w:tr>
+      <w:tr>
+        <w:trPr>
+          <w:trHeight w:val="133"/>
+        </w:trPr>
+        <w:tc>
+          <w:tcPr>
+            <w:tcW w:w="507" w:type="pct"/>
+            <w:tcBorders>
+              <w:top w:val="single" w:sz="6" w:space="0" w:color="auto"/>
+              <w:left w:val="single" w:sz="6" w:space="0" w:color="auto"/>
+              <w:bottom w:val="single" w:sz="6" w:space="0" w:color="auto"/>
+              <w:right w:val="single" w:sz="6" w:space="0" w:color="auto"/>
+            </w:tcBorders>
+            <w:shd w:val="clear" w:color="auto" w:fill="FFFFFF"/>
+            <w:tcMar>
+              <w:top w:w="150" w:type="dxa"/>
+              <w:left w:w="210" w:type="dxa"/>
+              <w:bottom w:w="150" w:type="dxa"/>
+              <w:right w:w="210" w:type="dxa"/>
+            </w:tcMar>
+            <w:vAlign w:val="center"/>
+            <w:hideMark/>
+          </w:tcPr>
+          <w:p>
+            <w:pPr>
+              <w:rPr>
+                <w:rFonts w:hint="eastAsia"/>
+              </w:rPr>
+            </w:pPr>
+            <w:r>
+              <w:rPr>
+                <w:rFonts w:hint="eastAsia"/>
+              </w:rPr>
+              <w:t>7</w:t>
+            </w:r>
+          </w:p>
+        </w:tc>
+        <w:tc>
+          <w:tcPr>
+            <w:tcW w:w="941" w:type="pct"/>
+            <w:tcBorders>
+              <w:top w:val="single" w:sz="6" w:space="0" w:color="auto"/>
+              <w:left w:val="single" w:sz="6" w:space="0" w:color="auto"/>
+              <w:bottom w:val="single" w:sz="6" w:space="0" w:color="auto"/>
+              <w:right w:val="single" w:sz="6" w:space="0" w:color="auto"/>
+            </w:tcBorders>
+            <w:shd w:val="clear" w:color="auto" w:fill="FFFFFF"/>
+            <w:tcMar>
+              <w:top w:w="150" w:type="dxa"/>
+              <w:left w:w="210" w:type="dxa"/>
+              <w:bottom w:w="150" w:type="dxa"/>
+              <w:right w:w="210" w:type="dxa"/>
+            </w:tcMar>
+            <w:vAlign w:val="center"/>
+            <w:hideMark/>
+          </w:tcPr>
+          <w:p>
+            <w:pPr>
+              <w:rPr>
+                <w:rFonts w:hint="eastAsia"/>
+              </w:rPr>
+            </w:pPr>
+            <w:r>
+              <w:rPr>
+                <w:rFonts w:hint="eastAsia"/>
+              </w:rPr>
+              <w:t>多城市季节气候数据积累</w:t>
+            </w:r>
+          </w:p>
+        </w:tc>
+        <w:tc>
+          <w:tcPr>
+            <w:tcW w:w="2736" w:type="pct"/>
+            <w:tcBorders>
+              <w:top w:val="single" w:sz="6" w:space="0" w:color="auto"/>
+              <w:left w:val="single" w:sz="6" w:space="0" w:color="auto"/>
+              <w:bottom w:val="single" w:sz="6" w:space="0" w:color="auto"/>
+              <w:right w:val="single" w:sz="6" w:space="0" w:color="auto"/>
+            </w:tcBorders>
+            <w:shd w:val="clear" w:color="auto" w:fill="FFFFFF"/>
+            <w:tcMar>
+              <w:top w:w="150" w:type="dxa"/>
+              <w:left w:w="210" w:type="dxa"/>
+              <w:bottom w:w="150" w:type="dxa"/>
+              <w:right w:w="210" w:type="dxa"/>
+            </w:tcMar>
+            <w:vAlign w:val="center"/>
+            <w:hideMark/>
+          </w:tcPr>
+          <w:p>
+            <w:pPr>
+              <w:rPr>
+                <w:rFonts w:hint="eastAsia"/>
+              </w:rPr>
+            </w:pPr>
+            <w:r>
+              <w:rPr>
+                <w:rFonts w:hint="eastAsia"/>
+              </w:rPr>
+              <w:t>建立城市气候档案数据库，覆盖</w:t>
+            </w:r>
+            <w:proofErr w:type="gramStart"/>
+            <w:r>
+              <w:rPr>
+                <w:rFonts w:hint="eastAsia"/>
+              </w:rPr>
+              <w:t>一</w:t>
+            </w:r>
+            <w:proofErr w:type="gramEnd"/>
+            <w:r>
+              <w:rPr>
+                <w:rFonts w:hint="eastAsia"/>
+              </w:rPr>
+              <w:t>二线城市气候特征；设计季节调整系数矩阵，结合用户反馈持续校准；参考公开气象数据</w:t>
+            </w:r>
+            <w:proofErr w:type="gramStart"/>
+            <w:r>
+              <w:rPr>
+                <w:rFonts w:hint="eastAsia"/>
+              </w:rPr>
+              <w:t>集建立</w:t>
+            </w:r>
+            <w:proofErr w:type="gramEnd"/>
+            <w:r>
+              <w:rPr>
+                <w:rFonts w:hint="eastAsia"/>
+              </w:rPr>
+              <w:t>基础参数，运营中逐步用真实数据替代</w:t>
+            </w:r>
+          </w:p>
+        </w:tc>
+        <w:tc>
+          <w:tcPr>
+            <w:tcW w:w="815" w:type="pct"/>
+            <w:tcBorders>
+              <w:top w:val="single" w:sz="6" w:space="0" w:color="auto"/>
+              <w:left w:val="single" w:sz="6" w:space="0" w:color="auto"/>
+              <w:bottom w:val="single" w:sz="6" w:space="0" w:color="auto"/>
+              <w:right w:val="single" w:sz="6" w:space="0" w:color="auto"/>
+            </w:tcBorders>
+            <w:shd w:val="clear" w:color="auto" w:fill="FFFFFF"/>
+            <w:tcMar>
+              <w:top w:w="150" w:type="dxa"/>
+              <w:left w:w="210" w:type="dxa"/>
+              <w:bottom w:w="150" w:type="dxa"/>
+              <w:right w:w="210" w:type="dxa"/>
+            </w:tcMar>
+            <w:vAlign w:val="center"/>
+            <w:hideMark/>
+          </w:tcPr>
+          <w:p>
+            <w:pPr>
+              <w:rPr>
+                <w:rFonts w:hint="eastAsia"/>
+                <w:b/>
+                <w:bCs/>
+              </w:rPr>
+            </w:pPr>
+            <w:r>
+              <w:rPr>
+                <w:rFonts w:hint="eastAsia"/>
+                <w:b/>
+                <w:bCs/>
+              </w:rPr>
+              <w:t>中</w:t>
+            </w:r>
+          </w:p>
+        </w:tc>
+      </w:tr>
+      <w:tr>
+        <w:trPr>
+          <w:trHeight w:val="133"/>
+        </w:trPr>
+        <w:tc>
+          <w:tcPr>
+            <w:tcW w:w="507" w:type="pct"/>
+            <w:tcBorders>
+              <w:top w:val="single" w:sz="6" w:space="0" w:color="auto"/>
+              <w:left w:val="single" w:sz="6" w:space="0" w:color="auto"/>
+              <w:bottom w:val="single" w:sz="6" w:space="0" w:color="auto"/>
+              <w:right w:val="single" w:sz="6" w:space="0" w:color="auto"/>
+            </w:tcBorders>
+            <w:shd w:val="clear" w:color="auto" w:fill="FFFFFF"/>
+            <w:tcMar>
+              <w:top w:w="150" w:type="dxa"/>
+              <w:left w:w="210" w:type="dxa"/>
+              <w:bottom w:w="150" w:type="dxa"/>
+              <w:right w:w="210" w:type="dxa"/>
+            </w:tcMar>
+            <w:vAlign w:val="center"/>
+            <w:hideMark/>
+          </w:tcPr>
+          <w:p>
+            <w:pPr>
+              <w:rPr>
+                <w:rFonts w:hint="eastAsia"/>
+              </w:rPr>
+            </w:pPr>
+            <w:r>
+              <w:rPr>
+                <w:rFonts w:hint="eastAsia"/>
+              </w:rPr>
+              <w:t>8</w:t>
+            </w:r>
+          </w:p>
+        </w:tc>
+        <w:tc>
+          <w:tcPr>
+            <w:tcW w:w="941" w:type="pct"/>
+            <w:tcBorders>
+              <w:top w:val="single" w:sz="6" w:space="0" w:color="auto"/>
+              <w:left w:val="single" w:sz="6" w:space="0" w:color="auto"/>
+              <w:bottom w:val="single" w:sz="6" w:space="0" w:color="auto"/>
+              <w:right w:val="single" w:sz="6" w:space="0" w:color="auto"/>
+            </w:tcBorders>
+            <w:shd w:val="clear" w:color="auto" w:fill="FFFFFF"/>
+            <w:tcMar>
+              <w:top w:w="150" w:type="dxa"/>
+              <w:left w:w="210" w:type="dxa"/>
+              <w:bottom w:w="150" w:type="dxa"/>
+              <w:right w:w="210" w:type="dxa"/>
+            </w:tcMar>
+            <w:vAlign w:val="center"/>
+            <w:hideMark/>
+          </w:tcPr>
+          <w:p>
+            <w:pPr>
+              <w:rPr>
+                <w:rFonts w:hint="eastAsia"/>
+              </w:rPr>
+            </w:pPr>
+            <w:r>
+              <w:rPr>
+                <w:rFonts w:hint="eastAsia"/>
+              </w:rPr>
+              <w:t>用户增长与留存</w:t>
+            </w:r>
+          </w:p>
+        </w:tc>
+        <w:tc>
+          <w:tcPr>
+            <w:tcW w:w="2736" w:type="pct"/>
+            <w:tcBorders>
+              <w:top w:val="single" w:sz="6" w:space="0" w:color="auto"/>
+              <w:left w:val="single" w:sz="6" w:space="0" w:color="auto"/>
+              <w:bottom w:val="single" w:sz="6" w:space="0" w:color="auto"/>
+              <w:right w:val="single" w:sz="6" w:space="0" w:color="auto"/>
+            </w:tcBorders>
+            <w:shd w:val="clear" w:color="auto" w:fill="FFFFFF"/>
+            <w:tcMar>
+              <w:top w:w="150" w:type="dxa"/>
+              <w:left w:w="210" w:type="dxa"/>
+              <w:bottom w:w="150" w:type="dxa"/>
+              <w:right w:w="210" w:type="dxa"/>
+            </w:tcMar>
+            <w:vAlign w:val="center"/>
+            <w:hideMark/>
+          </w:tcPr>
+          <w:p>
+            <w:pPr>
+              <w:rPr>
+                <w:rFonts w:hint="eastAsia"/>
+              </w:rPr>
+            </w:pPr>
+            <w:r>
+              <w:rPr>
+                <w:rFonts w:hint="eastAsia"/>
+              </w:rPr>
+              <w:t>"识别+提醒"作为核心钩子，驱动用户持续使用；建立植物百科和社区内容增强粘性；定期推送植物状态报告增强用户情感连接；设计社交裂变机制（分享打卡、海报生成）</w:t>
+            </w:r>
+          </w:p>
+        </w:tc>
+        <w:tc>
+          <w:tcPr>
+            <w:tcW w:w="815" w:type="pct"/>
+            <w:tcBorders>
+              <w:top w:val="single" w:sz="6" w:space="0" w:color="auto"/>
+              <w:left w:val="single" w:sz="6" w:space="0" w:color="auto"/>
+              <w:bottom w:val="single" w:sz="6" w:space="0" w:color="auto"/>
+              <w:right w:val="single" w:sz="6" w:space="0" w:color="auto"/>
+            </w:tcBorders>
+            <w:shd w:val="clear" w:color="auto" w:fill="FFFFFF"/>
+            <w:tcMar>
+              <w:top w:w="150" w:type="dxa"/>
+              <w:left w:w="210" w:type="dxa"/>
+              <w:bottom w:w="150" w:type="dxa"/>
+              <w:right w:w="210" w:type="dxa"/>
+            </w:tcMar>
+            <w:vAlign w:val="center"/>
+            <w:hideMark/>
+          </w:tcPr>
+          <w:p>
+            <w:pPr>
+              <w:rPr>
+                <w:rFonts w:hint="eastAsia"/>
+                <w:b/>
+                <w:bCs/>
+              </w:rPr>
+            </w:pPr>
+            <w:r>
+              <w:rPr>
+                <w:rFonts w:hint="eastAsia"/>
+                <w:b/>
+                <w:bCs/>
+              </w:rPr>
+              <w:t>高</w:t>
+            </w:r>
+          </w:p>
+        </w:tc>
+      </w:tr>
+      <w:tr>
+        <w:trPr>
+          <w:trHeight w:val="133"/>
+        </w:trPr>
+        <w:tc>
+          <w:tcPr>
+            <w:tcW w:w="507" w:type="pct"/>
+            <w:tcBorders>
+              <w:top w:val="single" w:sz="6" w:space="0" w:color="auto"/>
+              <w:left w:val="single" w:sz="6" w:space="0" w:color="auto"/>
+              <w:bottom w:val="single" w:sz="6" w:space="0" w:color="auto"/>
+              <w:right w:val="single" w:sz="6" w:space="0" w:color="auto"/>
+            </w:tcBorders>
+            <w:shd w:val="clear" w:color="auto" w:fill="FFFFFF"/>
+            <w:tcMar>
+              <w:top w:w="150" w:type="dxa"/>
+              <w:left w:w="210" w:type="dxa"/>
+              <w:bottom w:w="150" w:type="dxa"/>
+              <w:right w:w="210" w:type="dxa"/>
+            </w:tcMar>
+            <w:vAlign w:val="center"/>
+            <w:hideMark/>
+          </w:tcPr>
+          <w:p>
+            <w:pPr>
+              <w:rPr>
+                <w:rFonts w:hint="eastAsia"/>
+              </w:rPr>
+            </w:pPr>
+            <w:r>
+              <w:rPr>
+                <w:rFonts w:hint="eastAsia"/>
+              </w:rPr>
+              <w:t>9</w:t>
+            </w:r>
+          </w:p>
+        </w:tc>
+        <w:tc>
+          <w:tcPr>
+            <w:tcW w:w="941" w:type="pct"/>
+            <w:tcBorders>
+              <w:top w:val="single" w:sz="6" w:space="0" w:color="auto"/>
+              <w:left w:val="single" w:sz="6" w:space="0" w:color="auto"/>
+              <w:bottom w:val="single" w:sz="6" w:space="0" w:color="auto"/>
+              <w:right w:val="single" w:sz="6" w:space="0" w:color="auto"/>
+            </w:tcBorders>
+            <w:shd w:val="clear" w:color="auto" w:fill="FFFFFF"/>
+            <w:tcMar>
+              <w:top w:w="150" w:type="dxa"/>
+              <w:left w:w="210" w:type="dxa"/>
+              <w:bottom w:w="150" w:type="dxa"/>
+              <w:right w:w="210" w:type="dxa"/>
+            </w:tcMar>
+            <w:vAlign w:val="center"/>
+            <w:hideMark/>
+          </w:tcPr>
+          <w:p>
+            <w:pPr>
+              <w:rPr>
+                <w:rFonts w:hint="eastAsia"/>
+              </w:rPr>
+            </w:pPr>
+            <w:r>
+              <w:rPr>
+                <w:rFonts w:hint="eastAsia"/>
+              </w:rPr>
+              <w:t>付费转化率低</w:t>
+            </w:r>
+          </w:p>
+        </w:tc>
+        <w:tc>
+          <w:tcPr>
+            <w:tcW w:w="2736" w:type="pct"/>
+            <w:tcBorders>
+              <w:top w:val="single" w:sz="6" w:space="0" w:color="auto"/>
+              <w:left w:val="single" w:sz="6" w:space="0" w:color="auto"/>
+              <w:bottom w:val="single" w:sz="6" w:space="0" w:color="auto"/>
+              <w:right w:val="single" w:sz="6" w:space="0" w:color="auto"/>
+            </w:tcBorders>
+            <w:shd w:val="clear" w:color="auto" w:fill="FFFFFF"/>
+            <w:tcMar>
+              <w:top w:w="150" w:type="dxa"/>
+              <w:left w:w="210" w:type="dxa"/>
+              <w:bottom w:w="150" w:type="dxa"/>
+              <w:right w:w="210" w:type="dxa"/>
+            </w:tcMar>
+            <w:vAlign w:val="center"/>
+            <w:hideMark/>
+          </w:tcPr>
+          <w:p>
+            <w:pPr>
+              <w:rPr>
+                <w:rFonts w:hint="eastAsia"/>
+              </w:rPr>
+            </w:pPr>
+            <w:r>
+              <w:rPr>
+                <w:rFonts w:hint="eastAsia"/>
+              </w:rPr>
+              <w:t>分阶段定价测试：Beta免费→1元/月→9.9元/</w:t>
+            </w:r>
+            <w:proofErr w:type="gramStart"/>
+            <w:r>
+              <w:rPr>
+                <w:rFonts w:hint="eastAsia"/>
+              </w:rPr>
+              <w:t>月逐步</w:t>
+            </w:r>
+            <w:proofErr w:type="gramEnd"/>
+            <w:r>
+              <w:rPr>
+                <w:rFonts w:hint="eastAsia"/>
+              </w:rPr>
+              <w:t>验证；突出免费版与付费</w:t>
+            </w:r>
+            <w:proofErr w:type="gramStart"/>
+            <w:r>
+              <w:rPr>
+                <w:rFonts w:hint="eastAsia"/>
+              </w:rPr>
+              <w:t>版功能</w:t>
+            </w:r>
+            <w:proofErr w:type="gramEnd"/>
+            <w:r>
+              <w:rPr>
+                <w:rFonts w:hint="eastAsia"/>
+              </w:rPr>
+              <w:t>差异，提供7天免费试用；设置首月优惠、年度套餐折扣等促销策略</w:t>
+            </w:r>
+          </w:p>
+        </w:tc>
+        <w:tc>
+          <w:tcPr>
+            <w:tcW w:w="815" w:type="pct"/>
+            <w:tcBorders>
+              <w:top w:val="single" w:sz="6" w:space="0" w:color="auto"/>
+              <w:left w:val="single" w:sz="6" w:space="0" w:color="auto"/>
+              <w:bottom w:val="single" w:sz="6" w:space="0" w:color="auto"/>
+              <w:right w:val="single" w:sz="6" w:space="0" w:color="auto"/>
+            </w:tcBorders>
+            <w:shd w:val="clear" w:color="auto" w:fill="FFFFFF"/>
+            <w:tcMar>
+              <w:top w:w="150" w:type="dxa"/>
+              <w:left w:w="210" w:type="dxa"/>
+              <w:bottom w:w="150" w:type="dxa"/>
+              <w:right w:w="210" w:type="dxa"/>
+            </w:tcMar>
+            <w:vAlign w:val="center"/>
+            <w:hideMark/>
+          </w:tcPr>
+          <w:p>
+            <w:pPr>
+              <w:rPr>
+                <w:rFonts w:hint="eastAsia"/>
+                <w:b/>
+                <w:bCs/>
+              </w:rPr>
+            </w:pPr>
+            <w:r>
+              <w:rPr>
+                <w:rFonts w:hint="eastAsia"/>
+                <w:b/>
+                <w:bCs/>
+              </w:rPr>
+              <w:t>高</w:t>
+            </w:r>
+          </w:p>
+        </w:tc>
+      </w:tr>
+      <w:tr>
+        <w:trPr>
+          <w:trHeight w:val="1152"/>
+        </w:trPr>
+        <w:tc>
+          <w:tcPr>
+            <w:tcW w:w="507" w:type="pct"/>
+            <w:tcBorders>
+              <w:top w:val="single" w:sz="6" w:space="0" w:color="auto"/>
+              <w:left w:val="single" w:sz="6" w:space="0" w:color="auto"/>
+              <w:bottom w:val="single" w:sz="6" w:space="0" w:color="auto"/>
+              <w:right w:val="single" w:sz="6" w:space="0" w:color="auto"/>
+            </w:tcBorders>
+            <w:shd w:val="clear" w:color="auto" w:fill="FFFFFF"/>
+            <w:tcMar>
+              <w:top w:w="150" w:type="dxa"/>
+              <w:left w:w="210" w:type="dxa"/>
+              <w:bottom w:w="150" w:type="dxa"/>
+              <w:right w:w="210" w:type="dxa"/>
+            </w:tcMar>
+            <w:vAlign w:val="center"/>
+            <w:hideMark/>
+          </w:tcPr>
+          <w:p>
+            <w:pPr>
+              <w:rPr>
+                <w:rFonts w:hint="eastAsia"/>
+              </w:rPr>
+            </w:pPr>
+            <w:r>
+              <w:rPr>
+                <w:rFonts w:hint="eastAsia"/>
+              </w:rPr>
+              <w:t>10</w:t>
+            </w:r>
+          </w:p>
+        </w:tc>
+        <w:tc>
+          <w:tcPr>
+            <w:tcW w:w="941" w:type="pct"/>
+            <w:tcBorders>
+              <w:top w:val="single" w:sz="6" w:space="0" w:color="auto"/>
+              <w:left w:val="single" w:sz="6" w:space="0" w:color="auto"/>
+              <w:bottom w:val="single" w:sz="6" w:space="0" w:color="auto"/>
+              <w:right w:val="single" w:sz="6" w:space="0" w:color="auto"/>
+            </w:tcBorders>
+            <w:shd w:val="clear" w:color="auto" w:fill="FFFFFF"/>
+            <w:tcMar>
+              <w:top w:w="150" w:type="dxa"/>
+              <w:left w:w="210" w:type="dxa"/>
+              <w:bottom w:w="150" w:type="dxa"/>
+              <w:right w:w="210" w:type="dxa"/>
+            </w:tcMar>
+            <w:vAlign w:val="center"/>
+            <w:hideMark/>
+          </w:tcPr>
+          <w:p>
+            <w:pPr>
+              <w:rPr>
+                <w:rFonts w:hint="eastAsia"/>
+              </w:rPr>
+            </w:pPr>
+            <w:r>
+              <w:rPr>
+                <w:rFonts w:hint="eastAsia"/>
+              </w:rPr>
+              <w:t>高并发场景下系统稳定性</w:t>
+            </w:r>
+          </w:p>
+        </w:tc>
+        <w:tc>
+          <w:tcPr>
+            <w:tcW w:w="2736" w:type="pct"/>
+            <w:tcBorders>
+              <w:top w:val="single" w:sz="6" w:space="0" w:color="auto"/>
+              <w:left w:val="single" w:sz="6" w:space="0" w:color="auto"/>
+              <w:bottom w:val="single" w:sz="6" w:space="0" w:color="auto"/>
+              <w:right w:val="single" w:sz="6" w:space="0" w:color="auto"/>
+            </w:tcBorders>
+            <w:shd w:val="clear" w:color="auto" w:fill="FFFFFF"/>
+            <w:tcMar>
+              <w:top w:w="150" w:type="dxa"/>
+              <w:left w:w="210" w:type="dxa"/>
+              <w:bottom w:w="150" w:type="dxa"/>
+              <w:right w:w="210" w:type="dxa"/>
+            </w:tcMar>
+            <w:vAlign w:val="center"/>
+            <w:hideMark/>
+          </w:tcPr>
+          <w:p>
+            <w:pPr>
+              <w:rPr>
+                <w:rFonts w:hint="eastAsia"/>
+              </w:rPr>
+            </w:pPr>
+            <w:r>
+              <w:rPr>
+                <w:rFonts w:hint="eastAsia"/>
+              </w:rPr>
+              <w:t>使用</w:t>
+            </w:r>
+            <w:proofErr w:type="gramStart"/>
+            <w:r>
+              <w:rPr>
+                <w:rFonts w:hint="eastAsia"/>
+              </w:rPr>
+              <w:t>云服务</w:t>
+            </w:r>
+            <w:proofErr w:type="gramEnd"/>
+            <w:r>
+              <w:rPr>
+                <w:rFonts w:hint="eastAsia"/>
+              </w:rPr>
+              <w:t>自动弹性伸缩（阿里云/</w:t>
+            </w:r>
+            <w:proofErr w:type="gramStart"/>
+            <w:r>
+              <w:rPr>
+                <w:rFonts w:hint="eastAsia"/>
+              </w:rPr>
+              <w:t>腾讯云</w:t>
+            </w:r>
+            <w:proofErr w:type="gramEnd"/>
+            <w:r>
+              <w:rPr>
+                <w:rFonts w:hint="eastAsia"/>
+              </w:rPr>
+              <w:t>）；Redis缓存热点数据，减少数据库压力；消息队列异步处理非核心任务；设计降级策略，AI服务故障时提供基础功能兜底</w:t>
+            </w:r>
+          </w:p>
+        </w:tc>
+        <w:tc>
+          <w:tcPr>
+            <w:tcW w:w="815" w:type="pct"/>
+            <w:tcBorders>
+              <w:top w:val="single" w:sz="6" w:space="0" w:color="auto"/>
+              <w:left w:val="single" w:sz="6" w:space="0" w:color="auto"/>
+              <w:bottom w:val="single" w:sz="6" w:space="0" w:color="auto"/>
+              <w:right w:val="single" w:sz="6" w:space="0" w:color="auto"/>
+            </w:tcBorders>
+            <w:shd w:val="clear" w:color="auto" w:fill="FFFFFF"/>
+            <w:tcMar>
+              <w:top w:w="150" w:type="dxa"/>
+              <w:left w:w="210" w:type="dxa"/>
+              <w:bottom w:w="150" w:type="dxa"/>
+              <w:right w:w="210" w:type="dxa"/>
+            </w:tcMar>
+            <w:vAlign w:val="center"/>
+            <w:hideMark/>
+          </w:tcPr>
+          <w:p>
+            <w:pPr>
+              <w:rPr>
+                <w:rFonts w:hint="eastAsia"/>
+                <w:b/>
+                <w:bCs/>
+              </w:rPr>
+            </w:pPr>
+            <w:r>
+              <w:rPr>
+                <w:rFonts w:hint="eastAsia"/>
+                <w:b/>
+                <w:bCs/>
+              </w:rPr>
+              <w:t>低</w:t>
             </w:r>
           </w:p>
         </w:tc>
       </w:tr>
     </w:tbl>
+    <w:p>
+      <w:pPr>
+        <w:rPr>
+          <w:rFonts w:hint="eastAsia"/>
+          <w:b/>
+          <w:bCs/>
+        </w:rPr>
+      </w:pPr>
+    </w:p>
     <w:p>
       <w:pPr>
         <w:rPr>
@@ -820,6 +3617,7 @@
           <w:b/>
           <w:bCs/>
         </w:rPr>
+        <w:lastRenderedPageBreak/>
         <w:t>四、 项目执行计划</w:t>
       </w:r>
     </w:p>
@@ -885,7 +3683,6 @@
               </w:rPr>
             </w:pPr>
             <w:r>
-              <w:lastRenderedPageBreak/>
               <w:t>阶段</w:t>
             </w:r>
           </w:p>
@@ -1406,9 +4203,9 @@
         <w:tblLook w:val="04A0" w:firstRow="1" w:lastRow="0" w:firstColumn="1" w:lastColumn="0" w:noHBand="0" w:noVBand="1"/>
       </w:tblPr>
       <w:tblGrid>
-        <w:gridCol w:w="2760"/>
-        <w:gridCol w:w="1518"/>
-        <w:gridCol w:w="3198"/>
+        <w:gridCol w:w="2373"/>
+        <w:gridCol w:w="1364"/>
+        <w:gridCol w:w="4553"/>
       </w:tblGrid>
       <w:tr>
         <w:trPr>
@@ -1554,7 +4351,14 @@
             </w:tcMar>
             <w:hideMark/>
           </w:tcPr>
-          <w:p/>
+          <w:p>
+            <w:r>
+              <w:rPr>
+                <w:rFonts w:hint="eastAsia"/>
+              </w:rPr>
+              <w:t>800</w:t>
+            </w:r>
+          </w:p>
         </w:tc>
         <w:tc>
           <w:tcPr>
@@ -1573,7 +4377,63 @@
             </w:tcMar>
             <w:hideMark/>
           </w:tcPr>
-          <w:p/>
+          <w:p>
+            <w:r>
+              <w:rPr>
+                <w:rFonts w:hint="eastAsia"/>
+              </w:rPr>
+              <w:t>1. 完整PRD文档（含功能规格、交互流程、数据结构）</w:t>
+            </w:r>
+            <w:r>
+              <w:rPr>
+                <w:rFonts w:hint="eastAsia"/>
+              </w:rPr>
+              <w:br/>
+              <w:t xml:space="preserve">2. </w:t>
+            </w:r>
+            <w:proofErr w:type="gramStart"/>
+            <w:r>
+              <w:rPr>
+                <w:rFonts w:hint="eastAsia"/>
+              </w:rPr>
+              <w:t>竞品分析</w:t>
+            </w:r>
+            <w:proofErr w:type="gramEnd"/>
+            <w:r>
+              <w:rPr>
+                <w:rFonts w:hint="eastAsia"/>
+              </w:rPr>
+              <w:t>报告（</w:t>
+            </w:r>
+            <w:proofErr w:type="gramStart"/>
+            <w:r>
+              <w:rPr>
+                <w:rFonts w:hint="eastAsia"/>
+              </w:rPr>
+              <w:t>含功能</w:t>
+            </w:r>
+            <w:proofErr w:type="gramEnd"/>
+            <w:r>
+              <w:rPr>
+                <w:rFonts w:hint="eastAsia"/>
+              </w:rPr>
+              <w:t>对比表、SWOT分析）</w:t>
+            </w:r>
+            <w:r>
+              <w:rPr>
+                <w:rFonts w:hint="eastAsia"/>
+              </w:rPr>
+              <w:br/>
+              <w:t>3. 技术选型方案</w:t>
+            </w:r>
+            <w:r>
+              <w:rPr>
+                <w:rFonts w:hint="eastAsia"/>
+              </w:rPr>
+              <w:br/>
+              <w:t>4. 产品原型设计稿</w:t>
+            </w:r>
+          </w:p>
         </w:tc>
       </w:tr>
       <w:tr>
@@ -1617,7 +4477,14 @@
             </w:tcMar>
             <w:hideMark/>
           </w:tcPr>
-          <w:p/>
+          <w:p>
+            <w:r>
+              <w:rPr>
+                <w:rFonts w:hint="eastAsia"/>
+              </w:rPr>
+              <w:t>2500</w:t>
+            </w:r>
+          </w:p>
         </w:tc>
         <w:tc>
           <w:tcPr>
@@ -1636,7 +4503,35 @@
             </w:tcMar>
             <w:hideMark/>
           </w:tcPr>
-          <w:p/>
+          <w:p>
+            <w:r>
+              <w:rPr>
+                <w:rFonts w:hint="eastAsia"/>
+              </w:rPr>
+              <w:t>1. 可运行的MVP（含植物识别、养护计划、基础提醒）</w:t>
+            </w:r>
+            <w:r>
+              <w:rPr>
+                <w:rFonts w:hint="eastAsia"/>
+              </w:rPr>
+              <w:br/>
+              <w:t>2. 知识库基础版本（Top 100品种）</w:t>
+            </w:r>
+            <w:r>
+              <w:rPr>
+                <w:rFonts w:hint="eastAsia"/>
+              </w:rPr>
+              <w:br/>
+              <w:t>3. 天气API集成完成</w:t>
+            </w:r>
+            <w:r>
+              <w:rPr>
+                <w:rFonts w:hint="eastAsia"/>
+              </w:rPr>
+              <w:br/>
+              <w:t>4. 用户反馈收集机制</w:t>
+            </w:r>
+          </w:p>
         </w:tc>
       </w:tr>
       <w:tr>
@@ -1680,7 +4575,14 @@
             </w:tcMar>
             <w:hideMark/>
           </w:tcPr>
-          <w:p/>
+          <w:p>
+            <w:r>
+              <w:rPr>
+                <w:rFonts w:hint="eastAsia"/>
+              </w:rPr>
+              <w:t>1500</w:t>
+            </w:r>
+          </w:p>
         </w:tc>
         <w:tc>
           <w:tcPr>
@@ -1699,7 +4601,57 @@
             </w:tcMar>
             <w:hideMark/>
           </w:tcPr>
-          <w:p/>
+          <w:p>
+            <w:r>
+              <w:rPr>
+                <w:rFonts w:hint="eastAsia"/>
+              </w:rPr>
+              <w:t>1. 产品优化报告（</w:t>
+            </w:r>
+            <w:proofErr w:type="gramStart"/>
+            <w:r>
+              <w:rPr>
+                <w:rFonts w:hint="eastAsia"/>
+              </w:rPr>
+              <w:t>含问题</w:t>
+            </w:r>
+            <w:proofErr w:type="gramEnd"/>
+            <w:r>
+              <w:rPr>
+                <w:rFonts w:hint="eastAsia"/>
+              </w:rPr>
+              <w:t>修复清单、用户体验改进）</w:t>
+            </w:r>
+            <w:r>
+              <w:rPr>
+                <w:rFonts w:hint="eastAsia"/>
+              </w:rPr>
+              <w:br/>
+              <w:t>2. 运营数据报告（用户增长、留存、付费转化）</w:t>
+            </w:r>
+            <w:r>
+              <w:rPr>
+                <w:rFonts w:hint="eastAsia"/>
+              </w:rPr>
+              <w:br/>
+              <w:t>3. v1.0付</w:t>
+            </w:r>
+            <w:proofErr w:type="gramStart"/>
+            <w:r>
+              <w:rPr>
+                <w:rFonts w:hint="eastAsia"/>
+              </w:rPr>
+              <w:t>费版上线</w:t>
+            </w:r>
+            <w:proofErr w:type="gramEnd"/>
+            <w:r>
+              <w:rPr>
+                <w:rFonts w:hint="eastAsia"/>
+              </w:rPr>
+              <w:br/>
+              <w:t>4. 病害诊断功能上线</w:t>
+            </w:r>
+          </w:p>
         </w:tc>
       </w:tr>
       <w:tr>
@@ -1743,7 +4695,14 @@
             </w:tcMar>
             <w:hideMark/>
           </w:tcPr>
-          <w:p/>
+          <w:p>
+            <w:r>
+              <w:rPr>
+                <w:rFonts w:hint="eastAsia"/>
+              </w:rPr>
+              <w:t>200</w:t>
+            </w:r>
+          </w:p>
         </w:tc>
         <w:tc>
           <w:tcPr>
@@ -1762,7 +4721,49 @@
             </w:tcMar>
             <w:hideMark/>
           </w:tcPr>
-          <w:p/>
+          <w:p>
+            <w:r>
+              <w:rPr>
+                <w:rFonts w:hint="eastAsia"/>
+              </w:rPr>
+              <w:t>1. 产品演示视频（3-5分钟，</w:t>
+            </w:r>
+            <w:proofErr w:type="gramStart"/>
+            <w:r>
+              <w:rPr>
+                <w:rFonts w:hint="eastAsia"/>
+              </w:rPr>
+              <w:t>含核心</w:t>
+            </w:r>
+            <w:proofErr w:type="gramEnd"/>
+            <w:r>
+              <w:rPr>
+                <w:rFonts w:hint="eastAsia"/>
+              </w:rPr>
+              <w:t>功能演示）</w:t>
+            </w:r>
+            <w:r>
+              <w:rPr>
+                <w:rFonts w:hint="eastAsia"/>
+              </w:rPr>
+              <w:br/>
+              <w:t>2. 项目终结报告（含商业模式、三年规划）</w:t>
+            </w:r>
+            <w:r>
+              <w:rPr>
+                <w:rFonts w:hint="eastAsia"/>
+              </w:rPr>
+              <w:br/>
+              <w:t>3. 演示PPT</w:t>
+            </w:r>
+            <w:r>
+              <w:rPr>
+                <w:rFonts w:hint="eastAsia"/>
+              </w:rPr>
+              <w:br/>
+              <w:t>4. 下一阶段路线图</w:t>
+            </w:r>
+          </w:p>
         </w:tc>
       </w:tr>
       <w:tr>
@@ -1868,10 +4869,10 @@
         <w:tblLook w:val="04A0" w:firstRow="1" w:lastRow="0" w:firstColumn="1" w:lastColumn="0" w:noHBand="0" w:noVBand="1"/>
       </w:tblPr>
       <w:tblGrid>
-        <w:gridCol w:w="1291"/>
-        <w:gridCol w:w="3067"/>
-        <w:gridCol w:w="1160"/>
-        <w:gridCol w:w="1098"/>
+        <w:gridCol w:w="1067"/>
+        <w:gridCol w:w="5624"/>
+        <w:gridCol w:w="781"/>
+        <w:gridCol w:w="818"/>
       </w:tblGrid>
       <w:tr>
         <w:trPr>
@@ -1903,6 +4904,7 @@
               </w:rPr>
             </w:pPr>
             <w:r>
+              <w:lastRenderedPageBreak/>
               <w:t>费用科目</w:t>
             </w:r>
           </w:p>
@@ -2017,6 +5019,9 @@
             <w:hideMark/>
           </w:tcPr>
           <w:p>
+            <w:pPr>
+              <w:jc w:val="left"/>
+            </w:pPr>
             <w:proofErr w:type="gramStart"/>
             <w:r>
               <w:t>算力</w:t>
@@ -2048,11 +5053,19 @@
             <w:r>
               <w:rPr>
                 <w:rFonts w:hint="eastAsia"/>
-              </w:rPr>
-              <w:t>从哪个平台</w:t>
-            </w:r>
-            <w:r>
-              <w:t>GPU租用/API费用</w:t>
+                <w:b/>
+                <w:bCs/>
+              </w:rPr>
+              <w:t>AI API费用（11.0万）：百度植物识别、天气API、病害诊断、土壤识别模型调用费。</w:t>
+            </w:r>
+            <w:r>
+              <w:rPr>
+                <w:rFonts w:hint="eastAsia"/>
+                <w:b/>
+                <w:bCs/>
+              </w:rPr>
+              <w:br/>
+              <w:t>云服务（4.6万）：开发与生产环境服务器、带宽、存储、域名及AI监控优化费用。</w:t>
             </w:r>
           </w:p>
         </w:tc>
@@ -2138,7 +5151,21 @@
           </w:tcPr>
           <w:p>
             <w:r>
-              <w:t>数据集/软件授权</w:t>
+              <w:rPr>
+                <w:rFonts w:hint="eastAsia"/>
+                <w:b/>
+                <w:bCs/>
+              </w:rPr>
+              <w:t>AI工具订阅（3.2万）：GitHub Copilot、Cursor、Claude、AI视频生成工具等团队订阅费。</w:t>
+            </w:r>
+            <w:r>
+              <w:rPr>
+                <w:rFonts w:hint="eastAsia"/>
+                <w:b/>
+                <w:bCs/>
+              </w:rPr>
+              <w:br/>
+              <w:t>外部采购（3.0万）：行业报告、竞品数据服务、第三方选型对比服务。</w:t>
             </w:r>
           </w:p>
         </w:tc>
@@ -2224,7 +5251,12 @@
           </w:tcPr>
           <w:p>
             <w:r>
-              <w:t>外设/测试设备</w:t>
+              <w:rPr>
+                <w:rFonts w:hint="eastAsia"/>
+                <w:b/>
+                <w:bCs/>
+              </w:rPr>
+              <w:t>设备与工具（1.2万）：开发调试工具、复用现有设备及必要的硬件采购。</w:t>
             </w:r>
           </w:p>
         </w:tc>
@@ -2310,7 +5342,92 @@
           </w:tcPr>
           <w:p>
             <w:r>
-              <w:t>差旅/印刷/不可预见费</w:t>
+              <w:rPr>
+                <w:rFonts w:hint="eastAsia"/>
+                <w:b/>
+                <w:bCs/>
+              </w:rPr>
+              <w:t>运营推广（12.0万）</w:t>
+            </w:r>
+            <w:r>
+              <w:rPr>
+                <w:rFonts w:hint="eastAsia"/>
+              </w:rPr>
+              <w:t>：种子用户招募、营销推广文案配图、用户增长激励、比赛报名费。</w:t>
+            </w:r>
+            <w:r>
+              <w:rPr>
+                <w:rFonts w:hint="eastAsia"/>
+              </w:rPr>
+              <w:br/>
+            </w:r>
+            <w:r>
+              <w:rPr>
+                <w:rFonts w:hint="eastAsia"/>
+                <w:b/>
+                <w:bCs/>
+              </w:rPr>
+              <w:t>其他杂项（3.0万）</w:t>
+            </w:r>
+            <w:r>
+              <w:rPr>
+                <w:rFonts w:hint="eastAsia"/>
+              </w:rPr>
+              <w:t>：知识库AI批量处理扩充费。</w:t>
+            </w:r>
+            <w:r>
+              <w:rPr>
+                <w:rFonts w:hint="eastAsia"/>
+              </w:rPr>
+              <w:br/>
+            </w:r>
+            <w:r>
+              <w:rPr>
+                <w:rFonts w:hint="eastAsia"/>
+                <w:b/>
+                <w:bCs/>
+              </w:rPr>
+              <w:t>预留金（2.0万）</w:t>
+            </w:r>
+            <w:r>
+              <w:rPr>
+                <w:rFonts w:hint="eastAsia"/>
+              </w:rPr>
+              <w:t>：不可预见支出。</w:t>
+            </w:r>
+            <w:r>
+              <w:rPr>
+                <w:rFonts w:hint="eastAsia"/>
+              </w:rPr>
+              <w:br/>
+            </w:r>
+            <w:r>
+              <w:rPr>
+                <w:rFonts w:hint="eastAsia"/>
+                <w:b/>
+                <w:bCs/>
+              </w:rPr>
+              <w:t>差旅/印刷（3.0万）</w:t>
+            </w:r>
+            <w:r>
+              <w:rPr>
+                <w:rFonts w:hint="eastAsia"/>
+              </w:rPr>
+              <w:t>：市场调研差旅、材料制作与印刷（</w:t>
+            </w:r>
+            <w:r>
+              <w:rPr>
+                <w:rFonts w:hint="eastAsia"/>
+                <w:i/>
+                <w:iCs/>
+              </w:rPr>
+              <w:t>注：原预算未单列此项，此处从运营与杂项中预估划拨</w:t>
+            </w:r>
+            <w:r>
+              <w:rPr>
+                <w:rFonts w:hint="eastAsia"/>
+              </w:rPr>
+              <w:t>）。</w:t>
             </w:r>
           </w:p>
         </w:tc>
@@ -2561,6 +5678,232 @@
 <file path=word/numbering.xml><?xml version="1.0" encoding="utf-8"?>
 <w:numbering xmlns:wpc="http://schemas.microsoft.com/office/word/2010/wordprocessingCanvas" xmlns:cx="http://schemas.microsoft.com/office/drawing/2014/chartex" xmlns:cx1="http://schemas.microsoft.com/office/drawing/2015/9/8/chartex" xmlns:cx2="http://schemas.microsoft.com/office/drawing/2015/10/21/chartex" xmlns:cx3="http://schemas.microsoft.com/office/drawing/2016/5/9/chartex" xmlns:cx4="http://schemas.microsoft.com/office/drawing/2016/5/10/chartex" xmlns:cx5="http://schemas.microsoft.com/office/drawing/2016/5/11/chartex" xmlns:cx6="http://schemas.microsoft.com/office/drawing/2016/5/12/chartex" xmlns:cx7="http://schemas.microsoft.com/office/drawing/2016/5/13/chartex" xmlns:cx8="http://schemas.microsoft.com/office/drawing/2016/5/14/chartex" xmlns:mc="http://schemas.openxmlformats.org/markup-compatibility/2006" xmlns:aink="http://schemas.microsoft.com/office/drawing/2016/ink" xmlns:am3d="http://schemas.microsoft.com/office/drawing/2017/model3d" xmlns:o="urn:schemas-microsoft-com:office:office" xmlns:oel="http://schemas.microsoft.com/office/2019/extlst" xmlns:r="http://schemas.openxmlformats.org/officeDocument/2006/relationships" xmlns:m="http://schemas.openxmlformats.org/officeDocument/2006/math" xmlns:v="urn:schemas-microsoft-com:vml" xmlns:wp14="http://schemas.microsoft.com/office/word/2010/wordprocessingDrawing" xmlns:wp="http://schemas.openxmlformats.org/drawingml/2006/wordprocessingDrawing" xmlns:w10="urn:schemas-microsoft-com:office:word" xmlns:w="http://schemas.openxmlformats.org/wordprocessingml/2006/main" xmlns:w14="http://schemas.microsoft.com/office/word/2010/wordml" xmlns:w15="http://schemas.microsoft.com/office/word/2012/wordml" xmlns:w16cex="http://schemas.microsoft.com/office/word/2018/wordml/cex" xmlns:w16cid="http://schemas.microsoft.com/office/word/2016/wordml/cid" xmlns:w16="http://schemas.microsoft.com/office/word/2018/wordml" xmlns:w16du="http://schemas.microsoft.com/office/word/2023/wordml/word16du" xmlns:w16sdtdh="http://schemas.microsoft.com/office/word/2020/wordml/sdtdatahash" xmlns:w16sdtfl="http://schemas.microsoft.com/office/word/2024/wordml/sdtformatlock" xmlns:w16se="http://schemas.microsoft.com/office/word/2015/wordml/symex" xmlns:wpg="http://schemas.microsoft.com/office/word/2010/wordprocessingGroup" xmlns:wpi="http://schemas.microsoft.com/office/word/2010/wordprocessingInk" xmlns:wne="http://schemas.microsoft.com/office/word/2006/wordml" xmlns:wps="http://schemas.microsoft.com/office/word/2010/wordprocessingShape" mc:Ignorable="w14 w15 w16se w16cid w16 w16cex w16sdtdh w16sdtfl w16du wp14">
   <w:abstractNum w:abstractNumId="0" w15:restartNumberingAfterBreak="0">
+    <w:nsid w:val="04A843AF"/>
+    <w:multiLevelType w:val="multilevel"/>
+    <w:tmpl w:val="BBCAC5B6"/>
+    <w:lvl w:ilvl="0">
+      <w:start w:val="2"/>
+      <w:numFmt w:val="decimal"/>
+      <w:lvlText w:val="%1"/>
+      <w:lvlJc w:val="left"/>
+      <w:pPr>
+        <w:ind w:left="360" w:hanging="360"/>
+      </w:pPr>
+      <w:rPr>
+        <w:rFonts w:hint="default"/>
+      </w:rPr>
+    </w:lvl>
+    <w:lvl w:ilvl="1">
+      <w:start w:val="3"/>
+      <w:numFmt w:val="decimal"/>
+      <w:lvlText w:val="%1.%2"/>
+      <w:lvlJc w:val="left"/>
+      <w:pPr>
+        <w:ind w:left="360" w:hanging="360"/>
+      </w:pPr>
+      <w:rPr>
+        <w:rFonts w:hint="default"/>
+      </w:rPr>
+    </w:lvl>
+    <w:lvl w:ilvl="2">
+      <w:start w:val="1"/>
+      <w:numFmt w:val="decimal"/>
+      <w:lvlText w:val="%1.%2.%3"/>
+      <w:lvlJc w:val="left"/>
+      <w:pPr>
+        <w:ind w:left="720" w:hanging="720"/>
+      </w:pPr>
+      <w:rPr>
+        <w:rFonts w:hint="default"/>
+      </w:rPr>
+    </w:lvl>
+    <w:lvl w:ilvl="3">
+      <w:start w:val="1"/>
+      <w:numFmt w:val="decimal"/>
+      <w:lvlText w:val="%1.%2.%3.%4"/>
+      <w:lvlJc w:val="left"/>
+      <w:pPr>
+        <w:ind w:left="720" w:hanging="720"/>
+      </w:pPr>
+      <w:rPr>
+        <w:rFonts w:hint="default"/>
+      </w:rPr>
+    </w:lvl>
+    <w:lvl w:ilvl="4">
+      <w:start w:val="1"/>
+      <w:numFmt w:val="decimal"/>
+      <w:lvlText w:val="%1.%2.%3.%4.%5"/>
+      <w:lvlJc w:val="left"/>
+      <w:pPr>
+        <w:ind w:left="1080" w:hanging="1080"/>
+      </w:pPr>
+      <w:rPr>
+        <w:rFonts w:hint="default"/>
+      </w:rPr>
+    </w:lvl>
+    <w:lvl w:ilvl="5">
+      <w:start w:val="1"/>
+      <w:numFmt w:val="decimal"/>
+      <w:lvlText w:val="%1.%2.%3.%4.%5.%6"/>
+      <w:lvlJc w:val="left"/>
+      <w:pPr>
+        <w:ind w:left="1080" w:hanging="1080"/>
+      </w:pPr>
+      <w:rPr>
+        <w:rFonts w:hint="default"/>
+      </w:rPr>
+    </w:lvl>
+    <w:lvl w:ilvl="6">
+      <w:start w:val="1"/>
+      <w:numFmt w:val="decimal"/>
+      <w:lvlText w:val="%1.%2.%3.%4.%5.%6.%7"/>
+      <w:lvlJc w:val="left"/>
+      <w:pPr>
+        <w:ind w:left="1440" w:hanging="1440"/>
+      </w:pPr>
+      <w:rPr>
+        <w:rFonts w:hint="default"/>
+      </w:rPr>
+    </w:lvl>
+    <w:lvl w:ilvl="7">
+      <w:start w:val="1"/>
+      <w:numFmt w:val="decimal"/>
+      <w:lvlText w:val="%1.%2.%3.%4.%5.%6.%7.%8"/>
+      <w:lvlJc w:val="left"/>
+      <w:pPr>
+        <w:ind w:left="1440" w:hanging="1440"/>
+      </w:pPr>
+      <w:rPr>
+        <w:rFonts w:hint="default"/>
+      </w:rPr>
+    </w:lvl>
+    <w:lvl w:ilvl="8">
+      <w:start w:val="1"/>
+      <w:numFmt w:val="decimal"/>
+      <w:lvlText w:val="%1.%2.%3.%4.%5.%6.%7.%8.%9"/>
+      <w:lvlJc w:val="left"/>
+      <w:pPr>
+        <w:ind w:left="1800" w:hanging="1800"/>
+      </w:pPr>
+      <w:rPr>
+        <w:rFonts w:hint="default"/>
+      </w:rPr>
+    </w:lvl>
+  </w:abstractNum>
+  <w:abstractNum w:abstractNumId="1" w15:restartNumberingAfterBreak="0">
+    <w:nsid w:val="080B3E40"/>
+    <w:multiLevelType w:val="hybridMultilevel"/>
+    <w:tmpl w:val="C68ECFCE"/>
+    <w:lvl w:ilvl="0" w:tplc="04090001">
+      <w:start w:val="1"/>
+      <w:numFmt w:val="bullet"/>
+      <w:lvlText w:val=""/>
+      <w:lvlJc w:val="left"/>
+      <w:pPr>
+        <w:ind w:left="1160" w:hanging="440"/>
+      </w:pPr>
+      <w:rPr>
+        <w:rFonts w:ascii="Wingdings" w:hAnsi="Wingdings" w:hint="default"/>
+      </w:rPr>
+    </w:lvl>
+    <w:lvl w:ilvl="1" w:tplc="04090003" w:tentative="1">
+      <w:start w:val="1"/>
+      <w:numFmt w:val="bullet"/>
+      <w:lvlText w:val=""/>
+      <w:lvlJc w:val="left"/>
+      <w:pPr>
+        <w:ind w:left="1600" w:hanging="440"/>
+      </w:pPr>
+      <w:rPr>
+        <w:rFonts w:ascii="Wingdings" w:hAnsi="Wingdings" w:hint="default"/>
+      </w:rPr>
+    </w:lvl>
+    <w:lvl w:ilvl="2" w:tplc="04090005" w:tentative="1">
+      <w:start w:val="1"/>
+      <w:numFmt w:val="bullet"/>
+      <w:lvlText w:val=""/>
+      <w:lvlJc w:val="left"/>
+      <w:pPr>
+        <w:ind w:left="2040" w:hanging="440"/>
+      </w:pPr>
+      <w:rPr>
+        <w:rFonts w:ascii="Wingdings" w:hAnsi="Wingdings" w:hint="default"/>
+      </w:rPr>
+    </w:lvl>
+    <w:lvl w:ilvl="3" w:tplc="04090001" w:tentative="1">
+      <w:start w:val="1"/>
+      <w:numFmt w:val="bullet"/>
+      <w:lvlText w:val=""/>
+      <w:lvlJc w:val="left"/>
+      <w:pPr>
+        <w:ind w:left="2480" w:hanging="440"/>
+      </w:pPr>
+      <w:rPr>
+        <w:rFonts w:ascii="Wingdings" w:hAnsi="Wingdings" w:hint="default"/>
+      </w:rPr>
+    </w:lvl>
+    <w:lvl w:ilvl="4" w:tplc="04090003" w:tentative="1">
+      <w:start w:val="1"/>
+      <w:numFmt w:val="bullet"/>
+      <w:lvlText w:val=""/>
+      <w:lvlJc w:val="left"/>
+      <w:pPr>
+        <w:ind w:left="2920" w:hanging="440"/>
+      </w:pPr>
+      <w:rPr>
+        <w:rFonts w:ascii="Wingdings" w:hAnsi="Wingdings" w:hint="default"/>
+      </w:rPr>
+    </w:lvl>
+    <w:lvl w:ilvl="5" w:tplc="04090005" w:tentative="1">
+      <w:start w:val="1"/>
+      <w:numFmt w:val="bullet"/>
+      <w:lvlText w:val=""/>
+      <w:lvlJc w:val="left"/>
+      <w:pPr>
+        <w:ind w:left="3360" w:hanging="440"/>
+      </w:pPr>
+      <w:rPr>
+        <w:rFonts w:ascii="Wingdings" w:hAnsi="Wingdings" w:hint="default"/>
+      </w:rPr>
+    </w:lvl>
+    <w:lvl w:ilvl="6" w:tplc="04090001" w:tentative="1">
+      <w:start w:val="1"/>
+      <w:numFmt w:val="bullet"/>
+      <w:lvlText w:val=""/>
+      <w:lvlJc w:val="left"/>
+      <w:pPr>
+        <w:ind w:left="3800" w:hanging="440"/>
+      </w:pPr>
+      <w:rPr>
+        <w:rFonts w:ascii="Wingdings" w:hAnsi="Wingdings" w:hint="default"/>
+      </w:rPr>
+    </w:lvl>
+    <w:lvl w:ilvl="7" w:tplc="04090003" w:tentative="1">
+      <w:start w:val="1"/>
+      <w:numFmt w:val="bullet"/>
+      <w:lvlText w:val=""/>
+      <w:lvlJc w:val="left"/>
+      <w:pPr>
+        <w:ind w:left="4240" w:hanging="440"/>
+      </w:pPr>
+      <w:rPr>
+        <w:rFonts w:ascii="Wingdings" w:hAnsi="Wingdings" w:hint="default"/>
+      </w:rPr>
+    </w:lvl>
+    <w:lvl w:ilvl="8" w:tplc="04090005" w:tentative="1">
+      <w:start w:val="1"/>
+      <w:numFmt w:val="bullet"/>
+      <w:lvlText w:val=""/>
+      <w:lvlJc w:val="left"/>
+      <w:pPr>
+        <w:ind w:left="4680" w:hanging="440"/>
+      </w:pPr>
+      <w:rPr>
+        <w:rFonts w:ascii="Wingdings" w:hAnsi="Wingdings" w:hint="default"/>
+      </w:rPr>
+    </w:lvl>
+  </w:abstractNum>
+  <w:abstractNum w:abstractNumId="2" w15:restartNumberingAfterBreak="0">
     <w:nsid w:val="0DDB2C51"/>
     <w:multiLevelType w:val="multilevel"/>
     <w:tmpl w:val="B3C07914"/>
@@ -2673,7 +6016,7 @@
       </w:pPr>
     </w:lvl>
   </w:abstractNum>
-  <w:abstractNum w:abstractNumId="1" w15:restartNumberingAfterBreak="0">
+  <w:abstractNum w:abstractNumId="3" w15:restartNumberingAfterBreak="0">
     <w:nsid w:val="18E37CD3"/>
     <w:multiLevelType w:val="multilevel"/>
     <w:tmpl w:val="0EBA42E0"/>
@@ -2786,7 +6129,7 @@
       </w:pPr>
     </w:lvl>
   </w:abstractNum>
-  <w:abstractNum w:abstractNumId="2" w15:restartNumberingAfterBreak="0">
+  <w:abstractNum w:abstractNumId="4" w15:restartNumberingAfterBreak="0">
     <w:nsid w:val="1CAA5E44"/>
     <w:multiLevelType w:val="multilevel"/>
     <w:tmpl w:val="378C5B44"/>
@@ -2935,7 +6278,7 @@
       </w:rPr>
     </w:lvl>
   </w:abstractNum>
-  <w:abstractNum w:abstractNumId="3" w15:restartNumberingAfterBreak="0">
+  <w:abstractNum w:abstractNumId="5" w15:restartNumberingAfterBreak="0">
     <w:nsid w:val="2A6F29E4"/>
     <w:multiLevelType w:val="multilevel"/>
     <w:tmpl w:val="AEC2CB7E"/>
@@ -3084,7 +6427,7 @@
       </w:rPr>
     </w:lvl>
   </w:abstractNum>
-  <w:abstractNum w:abstractNumId="4" w15:restartNumberingAfterBreak="0">
+  <w:abstractNum w:abstractNumId="6" w15:restartNumberingAfterBreak="0">
     <w:nsid w:val="49464241"/>
     <w:multiLevelType w:val="multilevel"/>
     <w:tmpl w:val="11DC79D2"/>
@@ -3233,7 +6576,7 @@
       </w:rPr>
     </w:lvl>
   </w:abstractNum>
-  <w:abstractNum w:abstractNumId="5" w15:restartNumberingAfterBreak="0">
+  <w:abstractNum w:abstractNumId="7" w15:restartNumberingAfterBreak="0">
     <w:nsid w:val="7D6A2DDD"/>
     <w:multiLevelType w:val="multilevel"/>
     <w:tmpl w:val="6AC0D1B0"/>
@@ -3383,22 +6726,28 @@
     </w:lvl>
   </w:abstractNum>
   <w:num w:numId="1" w16cid:durableId="1774204568">
+    <w:abstractNumId w:val="7"/>
+  </w:num>
+  <w:num w:numId="2" w16cid:durableId="1999963759">
+    <w:abstractNumId w:val="3"/>
+  </w:num>
+  <w:num w:numId="3" w16cid:durableId="1864896418">
+    <w:abstractNumId w:val="6"/>
+  </w:num>
+  <w:num w:numId="4" w16cid:durableId="1481842803">
+    <w:abstractNumId w:val="4"/>
+  </w:num>
+  <w:num w:numId="5" w16cid:durableId="1258176596">
+    <w:abstractNumId w:val="2"/>
+  </w:num>
+  <w:num w:numId="6" w16cid:durableId="680746196">
     <w:abstractNumId w:val="5"/>
   </w:num>
-  <w:num w:numId="2" w16cid:durableId="1999963759">
-    <w:abstractNumId w:val="1"/>
-  </w:num>
-  <w:num w:numId="3" w16cid:durableId="1864896418">
-    <w:abstractNumId w:val="4"/>
-  </w:num>
-  <w:num w:numId="4" w16cid:durableId="1481842803">
-    <w:abstractNumId w:val="2"/>
-  </w:num>
-  <w:num w:numId="5" w16cid:durableId="1258176596">
+  <w:num w:numId="7" w16cid:durableId="1061292050">
     <w:abstractNumId w:val="0"/>
   </w:num>
-  <w:num w:numId="6" w16cid:durableId="680746196">
-    <w:abstractNumId w:val="3"/>
+  <w:num w:numId="8" w16cid:durableId="1004280012">
+    <w:abstractNumId w:val="1"/>
   </w:num>
 </w:numbering>
 </file>
@@ -4323,6 +7672,21 @@
       <w:spacing w:val="5"/>
     </w:rPr>
   </w:style>
+  <w:style w:type="paragraph" w:styleId="NoSpacing">
+    <w:name w:val="No Spacing"/>
+    <w:uiPriority w:val="1"/>
+    <w:qFormat/>
+    <w:rsid w:val="00AE2522"/>
+    <w:pPr>
+      <w:widowControl w:val="0"/>
+      <w:jc w:val="both"/>
+    </w:pPr>
+  </w:style>
+  <w:style w:type="character" w:customStyle="1" w:styleId="qk-md-text">
+    <w:name w:val="qk-md-text"/>
+    <w:basedOn w:val="DefaultParagraphFont"/>
+    <w:rsid w:val="00E07CE5"/>
+  </w:style>
 </w:styles>
 </file>
 

</xml_diff>